<commit_message>
Unit 2 notes: fix audit findings (answer leaks, cue superscripts, headings, lime must-write rule, padded codes)
Co-Authored-By: Claude Sonnet 5.5 <noreply@anthropic.com>
Claude-Session: https://claude.ai/code/session_01LaT1EarAMnh5opQoFahNzN
</commit_message>
<xml_diff>
--- a/output/chem-u02/SHULL_CHEM_Guided_Notes_U02_S02.1-S02.5_Key.docx
+++ b/output/chem-u02/SHULL_CHEM_Guided_Notes_U02_S02.1-S02.5_Key.docx
@@ -77,7 +77,7 @@
                 <w:sz w:val="16"/>
                 <w:spacing w:val="26"/>
               </w:rPr>
-              <w:t>GUIDED NOTES · 5 SECTIONS · S2.1 – S2.5  ·  TEACHER KEY</w:t>
+              <w:t>GUIDED NOTES · 5 SECTIONS · S02.1 – S02.5  ·  TEACHER KEY</w:t>
             </w:r>
           </w:p>
         </w:tc>
@@ -346,7 +346,7 @@
                 <w:sz w:val="22"/>
                 <w:u w:val="none"/>
               </w:rPr>
-              <w:t>S2.1</w:t>
+              <w:t>S02.1</w:t>
             </w:r>
           </w:p>
         </w:tc>
@@ -472,7 +472,7 @@
                 <w:sz w:val="22"/>
                 <w:u w:val="none"/>
               </w:rPr>
-              <w:t>S2.2</w:t>
+              <w:t>S02.2</w:t>
             </w:r>
           </w:p>
         </w:tc>
@@ -598,7 +598,7 @@
                 <w:sz w:val="22"/>
                 <w:u w:val="none"/>
               </w:rPr>
-              <w:t>S2.3</w:t>
+              <w:t>S02.3</w:t>
             </w:r>
           </w:p>
         </w:tc>
@@ -724,7 +724,7 @@
                 <w:sz w:val="22"/>
                 <w:u w:val="none"/>
               </w:rPr>
-              <w:t>S2.4</w:t>
+              <w:t>S02.4</w:t>
             </w:r>
           </w:p>
         </w:tc>
@@ -850,7 +850,7 @@
                 <w:sz w:val="22"/>
                 <w:u w:val="none"/>
               </w:rPr>
-              <w:t>S2.5</w:t>
+              <w:t>S02.5</w:t>
             </w:r>
           </w:p>
         </w:tc>
@@ -1299,7 +1299,7 @@
                 <w:sz w:val="17"/>
                 <w:spacing w:val="26"/>
               </w:rPr>
-              <w:t>U2 / S2.1</w:t>
+              <w:t>U02 / S02.1</w:t>
             </w:r>
           </w:p>
           <w:p>
@@ -1432,7 +1432,9 @@
               <w:rPr>
                 <w:rFonts w:ascii="Trade Gothic Next" w:hAnsi="Trade Gothic Next"/>
                 <w:b w:val="0"/>
+                <w:color w:val="14161B"/>
                 <w:sz w:val="17"/>
+                <w:u w:val="none"/>
               </w:rPr>
               <w:t>Name for the energy-level label</w:t>
             </w:r>
@@ -1445,7 +1447,9 @@
               <w:rPr>
                 <w:rFonts w:ascii="Trade Gothic Next" w:hAnsi="Trade Gothic Next"/>
                 <w:b w:val="0"/>
+                <w:color w:val="14161B"/>
                 <w:sz w:val="17"/>
+                <w:u w:val="none"/>
               </w:rPr>
               <w:t>Definition — quantized</w:t>
             </w:r>
@@ -1458,7 +1462,9 @@
               <w:rPr>
                 <w:rFonts w:ascii="Trade Gothic Next" w:hAnsi="Trade Gothic Next"/>
                 <w:b w:val="0"/>
+                <w:color w:val="14161B"/>
                 <w:sz w:val="17"/>
+                <w:u w:val="none"/>
               </w:rPr>
               <w:t>Today's model against Bohr's</w:t>
             </w:r>
@@ -1491,10 +1497,10 @@
           </w:p>
           <w:p>
             <w:pPr>
-              <w:spacing w:after="40" w:before="0"/>
               <w:pBdr>
                 <w:left w:val="single" w:sz="18" w:space="6" w:color="A3E635"/>
               </w:pBdr>
+              <w:spacing w:after="40" w:before="0"/>
             </w:pPr>
             <w:r>
               <w:rPr>
@@ -1604,10 +1610,10 @@
           </w:p>
           <w:p>
             <w:pPr>
-              <w:spacing w:after="40" w:before="0"/>
               <w:pBdr>
                 <w:left w:val="single" w:sz="18" w:space="6" w:color="A3E635"/>
               </w:pBdr>
+              <w:spacing w:after="40" w:before="0"/>
             </w:pPr>
             <w:r>
               <w:rPr>
@@ -1767,7 +1773,9 @@
               <w:rPr>
                 <w:rFonts w:ascii="Trade Gothic Next" w:hAnsi="Trade Gothic Next"/>
                 <w:b w:val="0"/>
+                <w:color w:val="14161B"/>
                 <w:sz w:val="17"/>
+                <w:u w:val="none"/>
               </w:rPr>
               <w:t>Ground state</w:t>
             </w:r>
@@ -1780,7 +1788,9 @@
               <w:rPr>
                 <w:rFonts w:ascii="Trade Gothic Next" w:hAnsi="Trade Gothic Next"/>
                 <w:b w:val="0"/>
+                <w:color w:val="14161B"/>
                 <w:sz w:val="17"/>
+                <w:u w:val="none"/>
               </w:rPr>
               <w:t>Excited state</w:t>
             </w:r>
@@ -1793,7 +1803,9 @@
               <w:rPr>
                 <w:rFonts w:ascii="Trade Gothic Next" w:hAnsi="Trade Gothic Next"/>
                 <w:b w:val="0"/>
+                <w:color w:val="14161B"/>
                 <w:sz w:val="17"/>
+                <w:u w:val="none"/>
               </w:rPr>
               <w:t>Ionization</w:t>
             </w:r>
@@ -1806,7 +1818,9 @@
               <w:rPr>
                 <w:rFonts w:ascii="Trade Gothic Next" w:hAnsi="Trade Gothic Next"/>
                 <w:b w:val="0"/>
+                <w:color w:val="14161B"/>
                 <w:sz w:val="17"/>
+                <w:u w:val="none"/>
               </w:rPr>
               <w:t>Spacing of the higher levels</w:t>
             </w:r>
@@ -1960,9 +1974,9 @@
                     <w:right w:val="single" w:sz="4" w:color="C8CDC2"/>
                   </w:tcBorders>
                   <w:tcMar>
-                    <w:top w:w="50" w:type="dxa"/>
+                    <w:top w:w="30" w:type="dxa"/>
                     <w:left w:w="70" w:type="dxa"/>
-                    <w:bottom w:w="50" w:type="dxa"/>
+                    <w:bottom w:w="30" w:type="dxa"/>
                     <w:right w:w="70" w:type="dxa"/>
                   </w:tcMar>
                 </w:tcPr>
@@ -1992,9 +2006,9 @@
                     <w:right w:val="single" w:sz="4" w:color="C8CDC2"/>
                   </w:tcBorders>
                   <w:tcMar>
-                    <w:top w:w="50" w:type="dxa"/>
+                    <w:top w:w="30" w:type="dxa"/>
                     <w:left w:w="70" w:type="dxa"/>
-                    <w:bottom w:w="50" w:type="dxa"/>
+                    <w:bottom w:w="30" w:type="dxa"/>
                     <w:right w:w="70" w:type="dxa"/>
                   </w:tcMar>
                 </w:tcPr>
@@ -2069,9 +2083,9 @@
                     <w:right w:val="single" w:sz="4" w:color="C8CDC2"/>
                   </w:tcBorders>
                   <w:tcMar>
-                    <w:top w:w="50" w:type="dxa"/>
+                    <w:top w:w="30" w:type="dxa"/>
                     <w:left w:w="70" w:type="dxa"/>
-                    <w:bottom w:w="50" w:type="dxa"/>
+                    <w:bottom w:w="30" w:type="dxa"/>
                     <w:right w:w="70" w:type="dxa"/>
                   </w:tcMar>
                 </w:tcPr>
@@ -2101,9 +2115,9 @@
                     <w:right w:val="single" w:sz="4" w:color="C8CDC2"/>
                   </w:tcBorders>
                   <w:tcMar>
-                    <w:top w:w="50" w:type="dxa"/>
+                    <w:top w:w="30" w:type="dxa"/>
                     <w:left w:w="70" w:type="dxa"/>
-                    <w:bottom w:w="50" w:type="dxa"/>
+                    <w:bottom w:w="30" w:type="dxa"/>
                     <w:right w:w="70" w:type="dxa"/>
                   </w:tcMar>
                 </w:tcPr>
@@ -2158,9 +2172,9 @@
                     <w:right w:val="single" w:sz="4" w:color="C8CDC2"/>
                   </w:tcBorders>
                   <w:tcMar>
-                    <w:top w:w="50" w:type="dxa"/>
+                    <w:top w:w="30" w:type="dxa"/>
                     <w:left w:w="70" w:type="dxa"/>
-                    <w:bottom w:w="50" w:type="dxa"/>
+                    <w:bottom w:w="30" w:type="dxa"/>
                     <w:right w:w="70" w:type="dxa"/>
                   </w:tcMar>
                 </w:tcPr>
@@ -2190,9 +2204,9 @@
                     <w:right w:val="single" w:sz="4" w:color="C8CDC2"/>
                   </w:tcBorders>
                   <w:tcMar>
-                    <w:top w:w="50" w:type="dxa"/>
+                    <w:top w:w="30" w:type="dxa"/>
                     <w:left w:w="70" w:type="dxa"/>
-                    <w:bottom w:w="50" w:type="dxa"/>
+                    <w:bottom w:w="30" w:type="dxa"/>
                     <w:right w:w="70" w:type="dxa"/>
                   </w:tcMar>
                 </w:tcPr>
@@ -2841,7 +2855,7 @@
                 <w:sz w:val="17"/>
                 <w:spacing w:val="26"/>
               </w:rPr>
-              <w:t>U2 / S2.2</w:t>
+              <w:t>U02 / S02.2</w:t>
             </w:r>
           </w:p>
           <w:p>
@@ -2974,7 +2988,9 @@
               <w:rPr>
                 <w:rFonts w:ascii="Trade Gothic Next" w:hAnsi="Trade Gothic Next"/>
                 <w:b w:val="0"/>
+                <w:color w:val="14161B"/>
                 <w:sz w:val="17"/>
+                <w:u w:val="none"/>
               </w:rPr>
               <w:t>The four-step chain from level to electron</w:t>
             </w:r>
@@ -3062,10 +3078,10 @@
           </w:p>
           <w:p>
             <w:pPr>
-              <w:spacing w:after="40" w:before="0"/>
               <w:pBdr>
                 <w:left w:val="single" w:sz="18" w:space="6" w:color="A3E635"/>
               </w:pBdr>
+              <w:spacing w:after="40" w:before="0"/>
             </w:pPr>
             <w:r>
               <w:rPr>
@@ -3180,7 +3196,9 @@
               <w:rPr>
                 <w:rFonts w:ascii="Trade Gothic Next" w:hAnsi="Trade Gothic Next"/>
                 <w:b w:val="0"/>
+                <w:color w:val="14161B"/>
                 <w:sz w:val="17"/>
+                <w:u w:val="none"/>
               </w:rPr>
               <w:t>Definition — orbital</w:t>
             </w:r>
@@ -3193,7 +3211,9 @@
               <w:rPr>
                 <w:rFonts w:ascii="Trade Gothic Next" w:hAnsi="Trade Gothic Next"/>
                 <w:b w:val="0"/>
+                <w:color w:val="14161B"/>
                 <w:sz w:val="17"/>
+                <w:u w:val="none"/>
               </w:rPr>
               <w:t>Electron limit per orbital</w:t>
             </w:r>
@@ -3226,10 +3246,10 @@
           </w:p>
           <w:p>
             <w:pPr>
-              <w:spacing w:after="40" w:before="0"/>
               <w:pBdr>
                 <w:left w:val="single" w:sz="18" w:space="6" w:color="A3E635"/>
               </w:pBdr>
+              <w:spacing w:after="40" w:before="0"/>
             </w:pPr>
             <w:r>
               <w:rPr>
@@ -3349,7 +3369,9 @@
               <w:rPr>
                 <w:rFonts w:ascii="Trade Gothic Next" w:hAnsi="Trade Gothic Next"/>
                 <w:b w:val="0"/>
+                <w:color w:val="14161B"/>
                 <w:sz w:val="17"/>
+                <w:u w:val="none"/>
               </w:rPr>
               <w:t>Table — sublevels in each level</w:t>
             </w:r>
@@ -3362,7 +3384,9 @@
               <w:rPr>
                 <w:rFonts w:ascii="Trade Gothic Next" w:hAnsi="Trade Gothic Next"/>
                 <w:b w:val="0"/>
+                <w:color w:val="14161B"/>
                 <w:sz w:val="17"/>
+                <w:u w:val="none"/>
               </w:rPr>
               <w:t>Rule linking level number to sublevels</w:t>
             </w:r>
@@ -3546,9 +3570,9 @@
                     <w:right w:val="single" w:sz="4" w:color="C8CDC2"/>
                   </w:tcBorders>
                   <w:tcMar>
-                    <w:top w:w="50" w:type="dxa"/>
+                    <w:top w:w="30" w:type="dxa"/>
                     <w:left w:w="70" w:type="dxa"/>
-                    <w:bottom w:w="50" w:type="dxa"/>
+                    <w:bottom w:w="30" w:type="dxa"/>
                     <w:right w:w="70" w:type="dxa"/>
                   </w:tcMar>
                 </w:tcPr>
@@ -3578,9 +3602,9 @@
                     <w:right w:val="single" w:sz="4" w:color="C8CDC2"/>
                   </w:tcBorders>
                   <w:tcMar>
-                    <w:top w:w="50" w:type="dxa"/>
+                    <w:top w:w="30" w:type="dxa"/>
                     <w:left w:w="70" w:type="dxa"/>
-                    <w:bottom w:w="50" w:type="dxa"/>
+                    <w:bottom w:w="30" w:type="dxa"/>
                     <w:right w:w="70" w:type="dxa"/>
                   </w:tcMar>
                 </w:tcPr>
@@ -3610,9 +3634,9 @@
                     <w:right w:val="single" w:sz="4" w:color="C8CDC2"/>
                   </w:tcBorders>
                   <w:tcMar>
-                    <w:top w:w="50" w:type="dxa"/>
+                    <w:top w:w="30" w:type="dxa"/>
                     <w:left w:w="70" w:type="dxa"/>
-                    <w:bottom w:w="50" w:type="dxa"/>
+                    <w:bottom w:w="30" w:type="dxa"/>
                     <w:right w:w="70" w:type="dxa"/>
                   </w:tcMar>
                 </w:tcPr>
@@ -3647,9 +3671,9 @@
                     <w:right w:val="single" w:sz="4" w:color="C8CDC2"/>
                   </w:tcBorders>
                   <w:tcMar>
-                    <w:top w:w="50" w:type="dxa"/>
+                    <w:top w:w="30" w:type="dxa"/>
                     <w:left w:w="70" w:type="dxa"/>
-                    <w:bottom w:w="50" w:type="dxa"/>
+                    <w:bottom w:w="30" w:type="dxa"/>
                     <w:right w:w="70" w:type="dxa"/>
                   </w:tcMar>
                 </w:tcPr>
@@ -3679,9 +3703,9 @@
                     <w:right w:val="single" w:sz="4" w:color="C8CDC2"/>
                   </w:tcBorders>
                   <w:tcMar>
-                    <w:top w:w="50" w:type="dxa"/>
+                    <w:top w:w="30" w:type="dxa"/>
                     <w:left w:w="70" w:type="dxa"/>
-                    <w:bottom w:w="50" w:type="dxa"/>
+                    <w:bottom w:w="30" w:type="dxa"/>
                     <w:right w:w="70" w:type="dxa"/>
                   </w:tcMar>
                 </w:tcPr>
@@ -3711,9 +3735,9 @@
                     <w:right w:val="single" w:sz="4" w:color="C8CDC2"/>
                   </w:tcBorders>
                   <w:tcMar>
-                    <w:top w:w="50" w:type="dxa"/>
+                    <w:top w:w="30" w:type="dxa"/>
                     <w:left w:w="70" w:type="dxa"/>
-                    <w:bottom w:w="50" w:type="dxa"/>
+                    <w:bottom w:w="30" w:type="dxa"/>
                     <w:right w:w="70" w:type="dxa"/>
                   </w:tcMar>
                 </w:tcPr>
@@ -3748,9 +3772,9 @@
                     <w:right w:val="single" w:sz="4" w:color="C8CDC2"/>
                   </w:tcBorders>
                   <w:tcMar>
-                    <w:top w:w="50" w:type="dxa"/>
+                    <w:top w:w="30" w:type="dxa"/>
                     <w:left w:w="70" w:type="dxa"/>
-                    <w:bottom w:w="50" w:type="dxa"/>
+                    <w:bottom w:w="30" w:type="dxa"/>
                     <w:right w:w="70" w:type="dxa"/>
                   </w:tcMar>
                 </w:tcPr>
@@ -3780,9 +3804,9 @@
                     <w:right w:val="single" w:sz="4" w:color="C8CDC2"/>
                   </w:tcBorders>
                   <w:tcMar>
-                    <w:top w:w="50" w:type="dxa"/>
+                    <w:top w:w="30" w:type="dxa"/>
                     <w:left w:w="70" w:type="dxa"/>
-                    <w:bottom w:w="50" w:type="dxa"/>
+                    <w:bottom w:w="30" w:type="dxa"/>
                     <w:right w:w="70" w:type="dxa"/>
                   </w:tcMar>
                 </w:tcPr>
@@ -3812,9 +3836,9 @@
                     <w:right w:val="single" w:sz="4" w:color="C8CDC2"/>
                   </w:tcBorders>
                   <w:tcMar>
-                    <w:top w:w="50" w:type="dxa"/>
+                    <w:top w:w="30" w:type="dxa"/>
                     <w:left w:w="70" w:type="dxa"/>
-                    <w:bottom w:w="50" w:type="dxa"/>
+                    <w:bottom w:w="30" w:type="dxa"/>
                     <w:right w:w="70" w:type="dxa"/>
                   </w:tcMar>
                 </w:tcPr>
@@ -3849,9 +3873,9 @@
                     <w:right w:val="single" w:sz="4" w:color="C8CDC2"/>
                   </w:tcBorders>
                   <w:tcMar>
-                    <w:top w:w="50" w:type="dxa"/>
+                    <w:top w:w="30" w:type="dxa"/>
                     <w:left w:w="70" w:type="dxa"/>
-                    <w:bottom w:w="50" w:type="dxa"/>
+                    <w:bottom w:w="30" w:type="dxa"/>
                     <w:right w:w="70" w:type="dxa"/>
                   </w:tcMar>
                 </w:tcPr>
@@ -3881,9 +3905,9 @@
                     <w:right w:val="single" w:sz="4" w:color="C8CDC2"/>
                   </w:tcBorders>
                   <w:tcMar>
-                    <w:top w:w="50" w:type="dxa"/>
+                    <w:top w:w="30" w:type="dxa"/>
                     <w:left w:w="70" w:type="dxa"/>
-                    <w:bottom w:w="50" w:type="dxa"/>
+                    <w:bottom w:w="30" w:type="dxa"/>
                     <w:right w:w="70" w:type="dxa"/>
                   </w:tcMar>
                 </w:tcPr>
@@ -3913,9 +3937,9 @@
                     <w:right w:val="single" w:sz="4" w:color="C8CDC2"/>
                   </w:tcBorders>
                   <w:tcMar>
-                    <w:top w:w="50" w:type="dxa"/>
+                    <w:top w:w="30" w:type="dxa"/>
                     <w:left w:w="70" w:type="dxa"/>
-                    <w:bottom w:w="50" w:type="dxa"/>
+                    <w:bottom w:w="30" w:type="dxa"/>
                     <w:right w:w="70" w:type="dxa"/>
                   </w:tcMar>
                 </w:tcPr>
@@ -4001,7 +4025,9 @@
               <w:rPr>
                 <w:rFonts w:ascii="Trade Gothic Next" w:hAnsi="Trade Gothic Next"/>
                 <w:b w:val="0"/>
+                <w:color w:val="14161B"/>
                 <w:sz w:val="17"/>
+                <w:u w:val="none"/>
               </w:rPr>
               <w:t>Table — orbitals and electrons per sublevel</w:t>
             </w:r>
@@ -4014,7 +4040,9 @@
               <w:rPr>
                 <w:rFonts w:ascii="Trade Gothic Next" w:hAnsi="Trade Gothic Next"/>
                 <w:b w:val="0"/>
+                <w:color w:val="14161B"/>
                 <w:sz w:val="17"/>
+                <w:u w:val="none"/>
               </w:rPr>
               <w:t>Formulas for a whole level</w:t>
             </w:r>
@@ -4062,10 +4090,10 @@
           </w:p>
           <w:p>
             <w:pPr>
-              <w:spacing w:after="40" w:before="0"/>
               <w:pBdr>
                 <w:left w:val="single" w:sz="18" w:space="6" w:color="A3E635"/>
               </w:pBdr>
+              <w:spacing w:after="40" w:before="0"/>
             </w:pPr>
             <w:r>
               <w:rPr>
@@ -4236,9 +4264,9 @@
                     <w:right w:val="single" w:sz="4" w:color="C8CDC2"/>
                   </w:tcBorders>
                   <w:tcMar>
-                    <w:top w:w="50" w:type="dxa"/>
+                    <w:top w:w="30" w:type="dxa"/>
                     <w:left w:w="70" w:type="dxa"/>
-                    <w:bottom w:w="50" w:type="dxa"/>
+                    <w:bottom w:w="30" w:type="dxa"/>
                     <w:right w:w="70" w:type="dxa"/>
                   </w:tcMar>
                 </w:tcPr>
@@ -4268,9 +4296,9 @@
                     <w:right w:val="single" w:sz="4" w:color="C8CDC2"/>
                   </w:tcBorders>
                   <w:tcMar>
-                    <w:top w:w="50" w:type="dxa"/>
+                    <w:top w:w="30" w:type="dxa"/>
                     <w:left w:w="70" w:type="dxa"/>
-                    <w:bottom w:w="50" w:type="dxa"/>
+                    <w:bottom w:w="30" w:type="dxa"/>
                     <w:right w:w="70" w:type="dxa"/>
                   </w:tcMar>
                 </w:tcPr>
@@ -4300,9 +4328,9 @@
                     <w:right w:val="single" w:sz="4" w:color="C8CDC2"/>
                   </w:tcBorders>
                   <w:tcMar>
-                    <w:top w:w="50" w:type="dxa"/>
+                    <w:top w:w="30" w:type="dxa"/>
                     <w:left w:w="70" w:type="dxa"/>
-                    <w:bottom w:w="50" w:type="dxa"/>
+                    <w:bottom w:w="30" w:type="dxa"/>
                     <w:right w:w="70" w:type="dxa"/>
                   </w:tcMar>
                 </w:tcPr>
@@ -4337,9 +4365,9 @@
                     <w:right w:val="single" w:sz="4" w:color="C8CDC2"/>
                   </w:tcBorders>
                   <w:tcMar>
-                    <w:top w:w="50" w:type="dxa"/>
+                    <w:top w:w="30" w:type="dxa"/>
                     <w:left w:w="70" w:type="dxa"/>
-                    <w:bottom w:w="50" w:type="dxa"/>
+                    <w:bottom w:w="30" w:type="dxa"/>
                     <w:right w:w="70" w:type="dxa"/>
                   </w:tcMar>
                 </w:tcPr>
@@ -4369,9 +4397,9 @@
                     <w:right w:val="single" w:sz="4" w:color="C8CDC2"/>
                   </w:tcBorders>
                   <w:tcMar>
-                    <w:top w:w="50" w:type="dxa"/>
+                    <w:top w:w="30" w:type="dxa"/>
                     <w:left w:w="70" w:type="dxa"/>
-                    <w:bottom w:w="50" w:type="dxa"/>
+                    <w:bottom w:w="30" w:type="dxa"/>
                     <w:right w:w="70" w:type="dxa"/>
                   </w:tcMar>
                 </w:tcPr>
@@ -4401,9 +4429,9 @@
                     <w:right w:val="single" w:sz="4" w:color="C8CDC2"/>
                   </w:tcBorders>
                   <w:tcMar>
-                    <w:top w:w="50" w:type="dxa"/>
+                    <w:top w:w="30" w:type="dxa"/>
                     <w:left w:w="70" w:type="dxa"/>
-                    <w:bottom w:w="50" w:type="dxa"/>
+                    <w:bottom w:w="30" w:type="dxa"/>
                     <w:right w:w="70" w:type="dxa"/>
                   </w:tcMar>
                 </w:tcPr>
@@ -4438,9 +4466,9 @@
                     <w:right w:val="single" w:sz="4" w:color="C8CDC2"/>
                   </w:tcBorders>
                   <w:tcMar>
-                    <w:top w:w="50" w:type="dxa"/>
+                    <w:top w:w="30" w:type="dxa"/>
                     <w:left w:w="70" w:type="dxa"/>
-                    <w:bottom w:w="50" w:type="dxa"/>
+                    <w:bottom w:w="30" w:type="dxa"/>
                     <w:right w:w="70" w:type="dxa"/>
                   </w:tcMar>
                 </w:tcPr>
@@ -4470,9 +4498,9 @@
                     <w:right w:val="single" w:sz="4" w:color="C8CDC2"/>
                   </w:tcBorders>
                   <w:tcMar>
-                    <w:top w:w="50" w:type="dxa"/>
+                    <w:top w:w="30" w:type="dxa"/>
                     <w:left w:w="70" w:type="dxa"/>
-                    <w:bottom w:w="50" w:type="dxa"/>
+                    <w:bottom w:w="30" w:type="dxa"/>
                     <w:right w:w="70" w:type="dxa"/>
                   </w:tcMar>
                 </w:tcPr>
@@ -4502,9 +4530,9 @@
                     <w:right w:val="single" w:sz="4" w:color="C8CDC2"/>
                   </w:tcBorders>
                   <w:tcMar>
-                    <w:top w:w="50" w:type="dxa"/>
+                    <w:top w:w="30" w:type="dxa"/>
                     <w:left w:w="70" w:type="dxa"/>
-                    <w:bottom w:w="50" w:type="dxa"/>
+                    <w:bottom w:w="30" w:type="dxa"/>
                     <w:right w:w="70" w:type="dxa"/>
                   </w:tcMar>
                 </w:tcPr>
@@ -4539,9 +4567,9 @@
                     <w:right w:val="single" w:sz="4" w:color="C8CDC2"/>
                   </w:tcBorders>
                   <w:tcMar>
-                    <w:top w:w="50" w:type="dxa"/>
+                    <w:top w:w="30" w:type="dxa"/>
                     <w:left w:w="70" w:type="dxa"/>
-                    <w:bottom w:w="50" w:type="dxa"/>
+                    <w:bottom w:w="30" w:type="dxa"/>
                     <w:right w:w="70" w:type="dxa"/>
                   </w:tcMar>
                 </w:tcPr>
@@ -4571,9 +4599,9 @@
                     <w:right w:val="single" w:sz="4" w:color="C8CDC2"/>
                   </w:tcBorders>
                   <w:tcMar>
-                    <w:top w:w="50" w:type="dxa"/>
+                    <w:top w:w="30" w:type="dxa"/>
                     <w:left w:w="70" w:type="dxa"/>
-                    <w:bottom w:w="50" w:type="dxa"/>
+                    <w:bottom w:w="30" w:type="dxa"/>
                     <w:right w:w="70" w:type="dxa"/>
                   </w:tcMar>
                 </w:tcPr>
@@ -4603,9 +4631,9 @@
                     <w:right w:val="single" w:sz="4" w:color="C8CDC2"/>
                   </w:tcBorders>
                   <w:tcMar>
-                    <w:top w:w="50" w:type="dxa"/>
+                    <w:top w:w="30" w:type="dxa"/>
                     <w:left w:w="70" w:type="dxa"/>
-                    <w:bottom w:w="50" w:type="dxa"/>
+                    <w:bottom w:w="30" w:type="dxa"/>
                     <w:right w:w="70" w:type="dxa"/>
                   </w:tcMar>
                 </w:tcPr>
@@ -4691,7 +4719,9 @@
               <w:rPr>
                 <w:rFonts w:ascii="Trade Gothic Next" w:hAnsi="Trade Gothic Next"/>
                 <w:b w:val="0"/>
+                <w:color w:val="14161B"/>
                 <w:sz w:val="17"/>
+                <w:u w:val="none"/>
               </w:rPr>
               <w:t>Block widths in columns</w:t>
             </w:r>
@@ -4704,7 +4734,9 @@
               <w:rPr>
                 <w:rFonts w:ascii="Trade Gothic Next" w:hAnsi="Trade Gothic Next"/>
                 <w:b w:val="0"/>
+                <w:color w:val="14161B"/>
                 <w:sz w:val="17"/>
+                <w:u w:val="none"/>
               </w:rPr>
               <w:t>Helium's placement</w:t>
             </w:r>
@@ -4717,7 +4749,9 @@
               <w:rPr>
                 <w:rFonts w:ascii="Trade Gothic Next" w:hAnsi="Trade Gothic Next"/>
                 <w:b w:val="0"/>
+                <w:color w:val="14161B"/>
                 <w:sz w:val="17"/>
+                <w:u w:val="none"/>
               </w:rPr>
               <w:t>Order of K and Ca</w:t>
             </w:r>
@@ -4941,9 +4975,9 @@
                     <w:right w:val="single" w:sz="4" w:color="C8CDC2"/>
                   </w:tcBorders>
                   <w:tcMar>
-                    <w:top w:w="50" w:type="dxa"/>
+                    <w:top w:w="30" w:type="dxa"/>
                     <w:left w:w="70" w:type="dxa"/>
-                    <w:bottom w:w="50" w:type="dxa"/>
+                    <w:bottom w:w="30" w:type="dxa"/>
                     <w:right w:w="70" w:type="dxa"/>
                   </w:tcMar>
                 </w:tcPr>
@@ -4973,9 +5007,9 @@
                     <w:right w:val="single" w:sz="4" w:color="C8CDC2"/>
                   </w:tcBorders>
                   <w:tcMar>
-                    <w:top w:w="50" w:type="dxa"/>
+                    <w:top w:w="30" w:type="dxa"/>
                     <w:left w:w="70" w:type="dxa"/>
-                    <w:bottom w:w="50" w:type="dxa"/>
+                    <w:bottom w:w="30" w:type="dxa"/>
                     <w:right w:w="70" w:type="dxa"/>
                   </w:tcMar>
                 </w:tcPr>
@@ -5020,9 +5054,9 @@
                     <w:right w:val="single" w:sz="4" w:color="C8CDC2"/>
                   </w:tcBorders>
                   <w:tcMar>
-                    <w:top w:w="50" w:type="dxa"/>
+                    <w:top w:w="30" w:type="dxa"/>
                     <w:left w:w="70" w:type="dxa"/>
-                    <w:bottom w:w="50" w:type="dxa"/>
+                    <w:bottom w:w="30" w:type="dxa"/>
                     <w:right w:w="70" w:type="dxa"/>
                   </w:tcMar>
                 </w:tcPr>
@@ -5052,9 +5086,9 @@
                     <w:right w:val="single" w:sz="4" w:color="C8CDC2"/>
                   </w:tcBorders>
                   <w:tcMar>
-                    <w:top w:w="50" w:type="dxa"/>
+                    <w:top w:w="30" w:type="dxa"/>
                     <w:left w:w="70" w:type="dxa"/>
-                    <w:bottom w:w="50" w:type="dxa"/>
+                    <w:bottom w:w="30" w:type="dxa"/>
                     <w:right w:w="70" w:type="dxa"/>
                   </w:tcMar>
                 </w:tcPr>
@@ -5099,9 +5133,9 @@
                     <w:right w:val="single" w:sz="4" w:color="C8CDC2"/>
                   </w:tcBorders>
                   <w:tcMar>
-                    <w:top w:w="50" w:type="dxa"/>
+                    <w:top w:w="30" w:type="dxa"/>
                     <w:left w:w="70" w:type="dxa"/>
-                    <w:bottom w:w="50" w:type="dxa"/>
+                    <w:bottom w:w="30" w:type="dxa"/>
                     <w:right w:w="70" w:type="dxa"/>
                   </w:tcMar>
                 </w:tcPr>
@@ -5131,9 +5165,9 @@
                     <w:right w:val="single" w:sz="4" w:color="C8CDC2"/>
                   </w:tcBorders>
                   <w:tcMar>
-                    <w:top w:w="50" w:type="dxa"/>
+                    <w:top w:w="30" w:type="dxa"/>
                     <w:left w:w="70" w:type="dxa"/>
-                    <w:bottom w:w="50" w:type="dxa"/>
+                    <w:bottom w:w="30" w:type="dxa"/>
                     <w:right w:w="70" w:type="dxa"/>
                   </w:tcMar>
                 </w:tcPr>
@@ -5178,9 +5212,9 @@
                     <w:right w:val="single" w:sz="4" w:color="C8CDC2"/>
                   </w:tcBorders>
                   <w:tcMar>
-                    <w:top w:w="50" w:type="dxa"/>
+                    <w:top w:w="30" w:type="dxa"/>
                     <w:left w:w="70" w:type="dxa"/>
-                    <w:bottom w:w="50" w:type="dxa"/>
+                    <w:bottom w:w="30" w:type="dxa"/>
                     <w:right w:w="70" w:type="dxa"/>
                   </w:tcMar>
                 </w:tcPr>
@@ -5210,9 +5244,9 @@
                     <w:right w:val="single" w:sz="4" w:color="C8CDC2"/>
                   </w:tcBorders>
                   <w:tcMar>
-                    <w:top w:w="50" w:type="dxa"/>
+                    <w:top w:w="30" w:type="dxa"/>
                     <w:left w:w="70" w:type="dxa"/>
-                    <w:bottom w:w="50" w:type="dxa"/>
+                    <w:bottom w:w="30" w:type="dxa"/>
                     <w:right w:w="70" w:type="dxa"/>
                   </w:tcMar>
                 </w:tcPr>
@@ -5308,7 +5342,9 @@
               <w:rPr>
                 <w:rFonts w:ascii="Trade Gothic Next" w:hAnsi="Trade Gothic Next"/>
                 <w:b w:val="0"/>
+                <w:color w:val="14161B"/>
                 <w:sz w:val="17"/>
+                <w:u w:val="none"/>
               </w:rPr>
               <w:t>Sublevels in n = 3</w:t>
             </w:r>
@@ -5321,7 +5357,9 @@
               <w:rPr>
                 <w:rFonts w:ascii="Trade Gothic Next" w:hAnsi="Trade Gothic Next"/>
                 <w:b w:val="0"/>
+                <w:color w:val="14161B"/>
                 <w:sz w:val="17"/>
+                <w:u w:val="none"/>
               </w:rPr>
               <w:t>Electrons in 4f</w:t>
             </w:r>
@@ -5334,7 +5372,9 @@
               <w:rPr>
                 <w:rFonts w:ascii="Trade Gothic Next" w:hAnsi="Trade Gothic Next"/>
                 <w:b w:val="0"/>
+                <w:color w:val="14161B"/>
                 <w:sz w:val="17"/>
+                <w:u w:val="none"/>
               </w:rPr>
               <w:t>Orbitals in n = 4</w:t>
             </w:r>
@@ -5347,7 +5387,9 @@
               <w:rPr>
                 <w:rFonts w:ascii="Trade Gothic Next" w:hAnsi="Trade Gothic Next"/>
                 <w:b w:val="0"/>
+                <w:color w:val="14161B"/>
                 <w:sz w:val="17"/>
+                <w:u w:val="none"/>
               </w:rPr>
               <w:t>Totals for n = 3</w:t>
             </w:r>
@@ -5986,7 +6028,7 @@
                 <w:sz w:val="17"/>
                 <w:spacing w:val="26"/>
               </w:rPr>
-              <w:t>U2 / S2.3</w:t>
+              <w:t>U02 / S02.3</w:t>
             </w:r>
           </w:p>
           <w:p>
@@ -6119,7 +6161,9 @@
               <w:rPr>
                 <w:rFonts w:ascii="Trade Gothic Next" w:hAnsi="Trade Gothic Next"/>
                 <w:b w:val="0"/>
+                <w:color w:val="14161B"/>
                 <w:sz w:val="17"/>
+                <w:u w:val="none"/>
               </w:rPr>
               <w:t>Definition — electron configuration</w:t>
             </w:r>
@@ -6132,7 +6176,9 @@
               <w:rPr>
                 <w:rFonts w:ascii="Trade Gothic Next" w:hAnsi="Trade Gothic Next"/>
                 <w:b w:val="0"/>
+                <w:color w:val="14161B"/>
                 <w:sz w:val="17"/>
+                <w:u w:val="none"/>
               </w:rPr>
               <w:t>Number of filling rules</w:t>
             </w:r>
@@ -6165,10 +6211,10 @@
           </w:p>
           <w:p>
             <w:pPr>
-              <w:spacing w:after="40" w:before="0"/>
               <w:pBdr>
                 <w:left w:val="single" w:sz="18" w:space="6" w:color="A3E635"/>
               </w:pBdr>
+              <w:spacing w:after="40" w:before="0"/>
             </w:pPr>
             <w:r>
               <w:rPr>
@@ -6338,7 +6384,9 @@
               <w:rPr>
                 <w:rFonts w:ascii="Trade Gothic Next" w:hAnsi="Trade Gothic Next"/>
                 <w:b w:val="0"/>
+                <w:color w:val="14161B"/>
                 <w:sz w:val="17"/>
+                <w:u w:val="none"/>
               </w:rPr>
               <w:t>Table — the three parts of 2p⁴</w:t>
             </w:r>
@@ -6351,7 +6399,9 @@
               <w:rPr>
                 <w:rFonts w:ascii="Trade Gothic Next" w:hAnsi="Trade Gothic Next"/>
                 <w:b w:val="0"/>
+                <w:color w:val="14161B"/>
                 <w:sz w:val="17"/>
+                <w:u w:val="none"/>
               </w:rPr>
               <w:t>Check for a neutral atom</w:t>
             </w:r>
@@ -6439,10 +6489,10 @@
           </w:p>
           <w:p>
             <w:pPr>
-              <w:spacing w:after="40" w:before="0"/>
               <w:pBdr>
                 <w:left w:val="single" w:sz="18" w:space="6" w:color="A3E635"/>
               </w:pBdr>
+              <w:spacing w:after="40" w:before="0"/>
             </w:pPr>
             <w:r>
               <w:rPr>
@@ -6563,9 +6613,9 @@
                     <w:right w:val="single" w:sz="4" w:color="C8CDC2"/>
                   </w:tcBorders>
                   <w:tcMar>
-                    <w:top w:w="50" w:type="dxa"/>
+                    <w:top w:w="30" w:type="dxa"/>
                     <w:left w:w="70" w:type="dxa"/>
-                    <w:bottom w:w="50" w:type="dxa"/>
+                    <w:bottom w:w="30" w:type="dxa"/>
                     <w:right w:w="70" w:type="dxa"/>
                   </w:tcMar>
                 </w:tcPr>
@@ -6595,9 +6645,9 @@
                     <w:right w:val="single" w:sz="4" w:color="C8CDC2"/>
                   </w:tcBorders>
                   <w:tcMar>
-                    <w:top w:w="50" w:type="dxa"/>
+                    <w:top w:w="30" w:type="dxa"/>
                     <w:left w:w="70" w:type="dxa"/>
-                    <w:bottom w:w="50" w:type="dxa"/>
+                    <w:bottom w:w="30" w:type="dxa"/>
                     <w:right w:w="70" w:type="dxa"/>
                   </w:tcMar>
                 </w:tcPr>
@@ -6632,9 +6682,9 @@
                     <w:right w:val="single" w:sz="4" w:color="C8CDC2"/>
                   </w:tcBorders>
                   <w:tcMar>
-                    <w:top w:w="50" w:type="dxa"/>
+                    <w:top w:w="30" w:type="dxa"/>
                     <w:left w:w="70" w:type="dxa"/>
-                    <w:bottom w:w="50" w:type="dxa"/>
+                    <w:bottom w:w="30" w:type="dxa"/>
                     <w:right w:w="70" w:type="dxa"/>
                   </w:tcMar>
                 </w:tcPr>
@@ -6664,9 +6714,9 @@
                     <w:right w:val="single" w:sz="4" w:color="C8CDC2"/>
                   </w:tcBorders>
                   <w:tcMar>
-                    <w:top w:w="50" w:type="dxa"/>
+                    <w:top w:w="30" w:type="dxa"/>
                     <w:left w:w="70" w:type="dxa"/>
-                    <w:bottom w:w="50" w:type="dxa"/>
+                    <w:bottom w:w="30" w:type="dxa"/>
                     <w:right w:w="70" w:type="dxa"/>
                   </w:tcMar>
                 </w:tcPr>
@@ -6701,9 +6751,9 @@
                     <w:right w:val="single" w:sz="4" w:color="C8CDC2"/>
                   </w:tcBorders>
                   <w:tcMar>
-                    <w:top w:w="50" w:type="dxa"/>
+                    <w:top w:w="30" w:type="dxa"/>
                     <w:left w:w="70" w:type="dxa"/>
-                    <w:bottom w:w="50" w:type="dxa"/>
+                    <w:bottom w:w="30" w:type="dxa"/>
                     <w:right w:w="70" w:type="dxa"/>
                   </w:tcMar>
                 </w:tcPr>
@@ -6733,9 +6783,9 @@
                     <w:right w:val="single" w:sz="4" w:color="C8CDC2"/>
                   </w:tcBorders>
                   <w:tcMar>
-                    <w:top w:w="50" w:type="dxa"/>
+                    <w:top w:w="30" w:type="dxa"/>
                     <w:left w:w="70" w:type="dxa"/>
-                    <w:bottom w:w="50" w:type="dxa"/>
+                    <w:bottom w:w="30" w:type="dxa"/>
                     <w:right w:w="70" w:type="dxa"/>
                   </w:tcMar>
                 </w:tcPr>
@@ -6821,7 +6871,9 @@
               <w:rPr>
                 <w:rFonts w:ascii="Trade Gothic Next" w:hAnsi="Trade Gothic Next"/>
                 <w:b w:val="0"/>
+                <w:color w:val="14161B"/>
                 <w:sz w:val="17"/>
+                <w:u w:val="none"/>
               </w:rPr>
               <w:t>Definition — Aufbau principle</w:t>
             </w:r>
@@ -6834,7 +6886,9 @@
               <w:rPr>
                 <w:rFonts w:ascii="Trade Gothic Next" w:hAnsi="Trade Gothic Next"/>
                 <w:b w:val="0"/>
+                <w:color w:val="14161B"/>
                 <w:sz w:val="17"/>
+                <w:u w:val="none"/>
               </w:rPr>
               <w:t>Filling order, first nine sublevels</w:t>
             </w:r>
@@ -6847,7 +6901,9 @@
               <w:rPr>
                 <w:rFonts w:ascii="Trade Gothic Next" w:hAnsi="Trade Gothic Next"/>
                 <w:b w:val="0"/>
+                <w:color w:val="14161B"/>
                 <w:sz w:val="17"/>
+                <w:u w:val="none"/>
               </w:rPr>
               <w:t>Maximum electrons per sublevel</w:t>
             </w:r>
@@ -6880,10 +6936,10 @@
           </w:p>
           <w:p>
             <w:pPr>
-              <w:spacing w:after="40" w:before="0"/>
               <w:pBdr>
                 <w:left w:val="single" w:sz="18" w:space="6" w:color="A3E635"/>
               </w:pBdr>
+              <w:spacing w:after="40" w:before="0"/>
             </w:pPr>
             <w:r>
               <w:rPr>
@@ -7228,7 +7284,9 @@
               <w:rPr>
                 <w:rFonts w:ascii="Trade Gothic Next" w:hAnsi="Trade Gothic Next"/>
                 <w:b w:val="0"/>
+                <w:color w:val="14161B"/>
                 <w:sz w:val="17"/>
+                <w:u w:val="none"/>
               </w:rPr>
               <w:t>Definition — Pauli rule</w:t>
             </w:r>
@@ -7241,7 +7299,9 @@
               <w:rPr>
                 <w:rFonts w:ascii="Trade Gothic Next" w:hAnsi="Trade Gothic Next"/>
                 <w:b w:val="0"/>
+                <w:color w:val="14161B"/>
                 <w:sz w:val="17"/>
+                <w:u w:val="none"/>
               </w:rPr>
               <w:t>Allowed and not allowed spins</w:t>
             </w:r>
@@ -7269,15 +7329,15 @@
                 <w:sz w:val="15"/>
                 <w:spacing w:val="26"/>
               </w:rPr>
-              <w:t>PAULI: TWO ELECTRONS, OPPOSITE SPINS</w:t>
-            </w:r>
-          </w:p>
-          <w:p>
-            <w:pPr>
-              <w:spacing w:after="40" w:before="0"/>
+              <w:t>PAULI RULE</w:t>
+            </w:r>
+          </w:p>
+          <w:p>
+            <w:pPr>
               <w:pBdr>
                 <w:left w:val="single" w:sz="18" w:space="6" w:color="A3E635"/>
               </w:pBdr>
+              <w:spacing w:after="40" w:before="0"/>
             </w:pPr>
             <w:r>
               <w:rPr>
@@ -7581,7 +7641,9 @@
               <w:rPr>
                 <w:rFonts w:ascii="Trade Gothic Next" w:hAnsi="Trade Gothic Next"/>
                 <w:b w:val="0"/>
+                <w:color w:val="14161B"/>
                 <w:sz w:val="17"/>
+                <w:u w:val="none"/>
               </w:rPr>
               <w:t>Definition — Hund's rule</w:t>
             </w:r>
@@ -7594,7 +7656,9 @@
               <w:rPr>
                 <w:rFonts w:ascii="Trade Gothic Next" w:hAnsi="Trade Gothic Next"/>
                 <w:b w:val="0"/>
+                <w:color w:val="14161B"/>
                 <w:sz w:val="17"/>
+                <w:u w:val="none"/>
               </w:rPr>
               <w:t>Carbon, nitrogen, oxygen in 2p</w:t>
             </w:r>
@@ -7622,15 +7686,15 @@
                 <w:sz w:val="15"/>
                 <w:spacing w:val="26"/>
               </w:rPr>
-              <w:t>HUND: ONE IN EACH BEFORE PAIRING</w:t>
-            </w:r>
-          </w:p>
-          <w:p>
-            <w:pPr>
-              <w:spacing w:after="40" w:before="0"/>
+              <w:t>HUND'S RULE</w:t>
+            </w:r>
+          </w:p>
+          <w:p>
+            <w:pPr>
               <w:pBdr>
                 <w:left w:val="single" w:sz="18" w:space="6" w:color="A3E635"/>
               </w:pBdr>
+              <w:spacing w:after="40" w:before="0"/>
             </w:pPr>
             <w:r>
               <w:rPr>
@@ -8169,7 +8233,9 @@
               <w:rPr>
                 <w:rFonts w:ascii="Trade Gothic Next" w:hAnsi="Trade Gothic Next"/>
                 <w:b w:val="0"/>
+                <w:color w:val="14161B"/>
                 <w:sz w:val="17"/>
+                <w:u w:val="none"/>
               </w:rPr>
               <w:t>Atomic number and electron count</w:t>
             </w:r>
@@ -8182,7 +8248,9 @@
               <w:rPr>
                 <w:rFonts w:ascii="Trade Gothic Next" w:hAnsi="Trade Gothic Next"/>
                 <w:b w:val="0"/>
+                <w:color w:val="14161B"/>
                 <w:sz w:val="17"/>
+                <w:u w:val="none"/>
               </w:rPr>
               <w:t>Full configuration</w:t>
             </w:r>
@@ -8195,7 +8263,9 @@
               <w:rPr>
                 <w:rFonts w:ascii="Trade Gothic Next" w:hAnsi="Trade Gothic Next"/>
                 <w:b w:val="0"/>
+                <w:color w:val="14161B"/>
                 <w:sz w:val="17"/>
+                <w:u w:val="none"/>
               </w:rPr>
               <w:t>Orbital diagram</w:t>
             </w:r>
@@ -8208,7 +8278,9 @@
               <w:rPr>
                 <w:rFonts w:ascii="Trade Gothic Next" w:hAnsi="Trade Gothic Next"/>
                 <w:b w:val="0"/>
+                <w:color w:val="14161B"/>
                 <w:sz w:val="17"/>
+                <w:u w:val="none"/>
               </w:rPr>
               <w:t>Unpaired electrons</w:t>
             </w:r>
@@ -8276,10 +8348,10 @@
           </w:p>
           <w:p>
             <w:pPr>
-              <w:spacing w:after="40" w:before="0"/>
               <w:pBdr>
                 <w:left w:val="single" w:sz="18" w:space="6" w:color="A3E635"/>
               </w:pBdr>
+              <w:spacing w:after="40" w:before="0"/>
             </w:pPr>
             <w:r>
               <w:rPr>
@@ -8665,7 +8737,9 @@
               <w:rPr>
                 <w:rFonts w:ascii="Trade Gothic Next" w:hAnsi="Trade Gothic Next"/>
                 <w:b w:val="0"/>
+                <w:color w:val="14161B"/>
                 <w:sz w:val="17"/>
+                <w:u w:val="none"/>
               </w:rPr>
               <w:t>Full configuration of Ar</w:t>
             </w:r>
@@ -8678,7 +8752,9 @@
               <w:rPr>
                 <w:rFonts w:ascii="Trade Gothic Next" w:hAnsi="Trade Gothic Next"/>
                 <w:b w:val="0"/>
+                <w:color w:val="14161B"/>
                 <w:sz w:val="17"/>
+                <w:u w:val="none"/>
               </w:rPr>
               <w:t>Check the sum</w:t>
             </w:r>
@@ -8746,10 +8822,10 @@
           </w:p>
           <w:p>
             <w:pPr>
-              <w:spacing w:after="40" w:before="0"/>
               <w:pBdr>
                 <w:left w:val="single" w:sz="18" w:space="6" w:color="A3E635"/>
               </w:pBdr>
+              <w:spacing w:after="40" w:before="0"/>
             </w:pPr>
             <w:r>
               <w:rPr>
@@ -8784,7 +8860,7 @@
                 <w:sz w:val="19"/>
                 <w:u w:val="none"/>
               </w:rPr>
-              <w:t xml:space="preserve">Check: 2 + 2 + 6 + 2 + 6 = </w:t>
+              <w:t xml:space="preserve">Check: the raised numbers add to </w:t>
             </w:r>
             <w:r>
               <w:rPr>
@@ -8859,7 +8935,9 @@
               <w:rPr>
                 <w:rFonts w:ascii="Trade Gothic Next" w:hAnsi="Trade Gothic Next"/>
                 <w:b w:val="0"/>
+                <w:color w:val="14161B"/>
                 <w:sz w:val="17"/>
+                <w:u w:val="none"/>
               </w:rPr>
               <w:t>Steps to shorten a configuration</w:t>
             </w:r>
@@ -8872,7 +8950,9 @@
               <w:rPr>
                 <w:rFonts w:ascii="Trade Gothic Next" w:hAnsi="Trade Gothic Next"/>
                 <w:b w:val="0"/>
+                <w:color w:val="14161B"/>
                 <w:sz w:val="17"/>
+                <w:u w:val="none"/>
               </w:rPr>
               <w:t>Germanium, shorthand</w:t>
             </w:r>
@@ -8905,10 +8985,10 @@
           </w:p>
           <w:p>
             <w:pPr>
-              <w:spacing w:after="40" w:before="0"/>
               <w:pBdr>
                 <w:left w:val="single" w:sz="18" w:space="6" w:color="A3E635"/>
               </w:pBdr>
+              <w:spacing w:after="40" w:before="0"/>
             </w:pPr>
             <w:r>
               <w:rPr>
@@ -8973,7 +9053,17 @@
                 <w:sz w:val="19"/>
                 <w:u w:val="none"/>
               </w:rPr>
-              <w:t xml:space="preserve"> electrons: 1s² 2s² 2p⁶ 3s² 3p⁶ 4s² 3d¹⁰ 4p²</w:t>
+              <w:t xml:space="preserve"> electrons: </w:t>
+            </w:r>
+            <w:r>
+              <w:rPr>
+                <w:rFonts w:ascii="Trade Gothic Next" w:hAnsi="Trade Gothic Next"/>
+                <w:b/>
+                <w:color w:val="4D730E"/>
+                <w:sz w:val="19"/>
+                <w:u w:val="single"/>
+              </w:rPr>
+              <w:t>1s² 2s² 2p⁶ 3s² 3p⁶ 4s² 3d¹⁰ 4p²</w:t>
             </w:r>
           </w:p>
           <w:p>
@@ -9128,7 +9218,9 @@
               <w:rPr>
                 <w:rFonts w:ascii="Trade Gothic Next" w:hAnsi="Trade Gothic Next"/>
                 <w:b w:val="0"/>
+                <w:color w:val="14161B"/>
                 <w:sz w:val="17"/>
+                <w:u w:val="none"/>
               </w:rPr>
               <w:t>Electrons left after [Ar]</w:t>
             </w:r>
@@ -9141,7 +9233,9 @@
               <w:rPr>
                 <w:rFonts w:ascii="Trade Gothic Next" w:hAnsi="Trade Gothic Next"/>
                 <w:b w:val="0"/>
+                <w:color w:val="14161B"/>
                 <w:sz w:val="17"/>
+                <w:u w:val="none"/>
               </w:rPr>
               <w:t>Iron shorthand</w:t>
             </w:r>
@@ -9154,7 +9248,9 @@
               <w:rPr>
                 <w:rFonts w:ascii="Trade Gothic Next" w:hAnsi="Trade Gothic Next"/>
                 <w:b w:val="0"/>
+                <w:color w:val="14161B"/>
                 <w:sz w:val="17"/>
+                <w:u w:val="none"/>
               </w:rPr>
               <w:t>Unpaired electrons in iron</w:t>
             </w:r>
@@ -9277,10 +9373,10 @@
           </w:p>
           <w:p>
             <w:pPr>
-              <w:spacing w:after="40" w:before="0"/>
               <w:pBdr>
                 <w:left w:val="single" w:sz="18" w:space="6" w:color="A3E635"/>
               </w:pBdr>
+              <w:spacing w:after="40" w:before="0"/>
             </w:pPr>
             <w:r>
               <w:rPr>
@@ -9310,7 +9406,27 @@
                 <w:sz w:val="19"/>
                 <w:u w:val="none"/>
               </w:rPr>
-              <w:t>, and 18 + 2 + 6 = 26</w:t>
+              <w:t xml:space="preserve">. The electrons add to </w:t>
+            </w:r>
+            <w:r>
+              <w:rPr>
+                <w:rFonts w:ascii="Trade Gothic Next" w:hAnsi="Trade Gothic Next"/>
+                <w:b/>
+                <w:color w:val="4D730E"/>
+                <w:sz w:val="19"/>
+                <w:u w:val="single"/>
+              </w:rPr>
+              <w:t>26</w:t>
+            </w:r>
+            <w:r>
+              <w:rPr>
+                <w:rFonts w:ascii="Trade Gothic Next" w:hAnsi="Trade Gothic Next"/>
+                <w:b/>
+                <w:color w:val="14161B"/>
+                <w:sz w:val="19"/>
+                <w:u w:val="none"/>
+              </w:rPr>
+              <w:t>.</w:t>
             </w:r>
           </w:p>
           <w:p>
@@ -9689,7 +9805,9 @@
               <w:rPr>
                 <w:rFonts w:ascii="Trade Gothic Next" w:hAnsi="Trade Gothic Next"/>
                 <w:b w:val="0"/>
+                <w:color w:val="14161B"/>
                 <w:sz w:val="17"/>
+                <w:u w:val="none"/>
               </w:rPr>
               <w:t>Br shorthand and check</w:t>
             </w:r>
@@ -9702,7 +9820,9 @@
               <w:rPr>
                 <w:rFonts w:ascii="Trade Gothic Next" w:hAnsi="Trade Gothic Next"/>
                 <w:b w:val="0"/>
+                <w:color w:val="14161B"/>
                 <w:sz w:val="17"/>
+                <w:u w:val="none"/>
               </w:rPr>
               <w:t>Ni shorthand and check</w:t>
             </w:r>
@@ -9780,7 +9900,7 @@
                 <w:sz w:val="19"/>
                 <w:u w:val="none"/>
               </w:rPr>
-              <w:t xml:space="preserve">, and 18 + 2 + 10 + 5 = </w:t>
+              <w:t xml:space="preserve">. The electrons add to </w:t>
             </w:r>
             <w:r>
               <w:rPr>
@@ -9792,6 +9912,16 @@
               </w:rPr>
               <w:t>35</w:t>
             </w:r>
+            <w:r>
+              <w:rPr>
+                <w:rFonts w:ascii="Trade Gothic Next" w:hAnsi="Trade Gothic Next"/>
+                <w:b w:val="0"/>
+                <w:color w:val="14161B"/>
+                <w:sz w:val="19"/>
+                <w:u w:val="none"/>
+              </w:rPr>
+              <w:t>.</w:t>
+            </w:r>
           </w:p>
           <w:p>
             <w:pPr>
@@ -9825,7 +9955,7 @@
                 <w:sz w:val="19"/>
                 <w:u w:val="none"/>
               </w:rPr>
-              <w:t xml:space="preserve">, and 18 + 2 + 8 = </w:t>
+              <w:t xml:space="preserve">. The electrons add to </w:t>
             </w:r>
             <w:r>
               <w:rPr>
@@ -9836,6 +9966,16 @@
                 <w:u w:val="single"/>
               </w:rPr>
               <w:t>28</w:t>
+            </w:r>
+            <w:r>
+              <w:rPr>
+                <w:rFonts w:ascii="Trade Gothic Next" w:hAnsi="Trade Gothic Next"/>
+                <w:b w:val="0"/>
+                <w:color w:val="14161B"/>
+                <w:sz w:val="19"/>
+                <w:u w:val="none"/>
+              </w:rPr>
+              <w:t>.</w:t>
             </w:r>
           </w:p>
           <w:p>
@@ -9925,7 +10065,9 @@
               <w:rPr>
                 <w:rFonts w:ascii="Trade Gothic Next" w:hAnsi="Trade Gothic Next"/>
                 <w:b w:val="0"/>
+                <w:color w:val="14161B"/>
                 <w:sz w:val="17"/>
+                <w:u w:val="none"/>
               </w:rPr>
               <w:t>Table — simple prediction against actual</w:t>
             </w:r>
@@ -9938,7 +10080,9 @@
               <w:rPr>
                 <w:rFonts w:ascii="Trade Gothic Next" w:hAnsi="Trade Gothic Next"/>
                 <w:b w:val="0"/>
+                <w:color w:val="14161B"/>
                 <w:sz w:val="17"/>
+                <w:u w:val="none"/>
               </w:rPr>
               <w:t>Reason for the exceptions</w:t>
             </w:r>
@@ -9986,10 +10130,10 @@
           </w:p>
           <w:p>
             <w:pPr>
-              <w:spacing w:after="40" w:before="0"/>
               <w:pBdr>
                 <w:left w:val="single" w:sz="18" w:space="6" w:color="A3E635"/>
               </w:pBdr>
+              <w:spacing w:after="40" w:before="0"/>
             </w:pPr>
             <w:r>
               <w:rPr>
@@ -10160,9 +10304,9 @@
                     <w:right w:val="single" w:sz="4" w:color="C8CDC2"/>
                   </w:tcBorders>
                   <w:tcMar>
-                    <w:top w:w="50" w:type="dxa"/>
+                    <w:top w:w="30" w:type="dxa"/>
                     <w:left w:w="70" w:type="dxa"/>
-                    <w:bottom w:w="50" w:type="dxa"/>
+                    <w:bottom w:w="30" w:type="dxa"/>
                     <w:right w:w="70" w:type="dxa"/>
                   </w:tcMar>
                 </w:tcPr>
@@ -10192,9 +10336,9 @@
                     <w:right w:val="single" w:sz="4" w:color="C8CDC2"/>
                   </w:tcBorders>
                   <w:tcMar>
-                    <w:top w:w="50" w:type="dxa"/>
+                    <w:top w:w="30" w:type="dxa"/>
                     <w:left w:w="70" w:type="dxa"/>
-                    <w:bottom w:w="50" w:type="dxa"/>
+                    <w:bottom w:w="30" w:type="dxa"/>
                     <w:right w:w="70" w:type="dxa"/>
                   </w:tcMar>
                 </w:tcPr>
@@ -10224,9 +10368,9 @@
                     <w:right w:val="single" w:sz="4" w:color="C8CDC2"/>
                   </w:tcBorders>
                   <w:tcMar>
-                    <w:top w:w="50" w:type="dxa"/>
+                    <w:top w:w="30" w:type="dxa"/>
                     <w:left w:w="70" w:type="dxa"/>
-                    <w:bottom w:w="50" w:type="dxa"/>
+                    <w:bottom w:w="30" w:type="dxa"/>
                     <w:right w:w="70" w:type="dxa"/>
                   </w:tcMar>
                 </w:tcPr>
@@ -10261,9 +10405,9 @@
                     <w:right w:val="single" w:sz="4" w:color="C8CDC2"/>
                   </w:tcBorders>
                   <w:tcMar>
-                    <w:top w:w="50" w:type="dxa"/>
+                    <w:top w:w="30" w:type="dxa"/>
                     <w:left w:w="70" w:type="dxa"/>
-                    <w:bottom w:w="50" w:type="dxa"/>
+                    <w:bottom w:w="30" w:type="dxa"/>
                     <w:right w:w="70" w:type="dxa"/>
                   </w:tcMar>
                 </w:tcPr>
@@ -10293,9 +10437,9 @@
                     <w:right w:val="single" w:sz="4" w:color="C8CDC2"/>
                   </w:tcBorders>
                   <w:tcMar>
-                    <w:top w:w="50" w:type="dxa"/>
+                    <w:top w:w="30" w:type="dxa"/>
                     <w:left w:w="70" w:type="dxa"/>
-                    <w:bottom w:w="50" w:type="dxa"/>
+                    <w:bottom w:w="30" w:type="dxa"/>
                     <w:right w:w="70" w:type="dxa"/>
                   </w:tcMar>
                 </w:tcPr>
@@ -10325,9 +10469,9 @@
                     <w:right w:val="single" w:sz="4" w:color="C8CDC2"/>
                   </w:tcBorders>
                   <w:tcMar>
-                    <w:top w:w="50" w:type="dxa"/>
+                    <w:top w:w="30" w:type="dxa"/>
                     <w:left w:w="70" w:type="dxa"/>
-                    <w:bottom w:w="50" w:type="dxa"/>
+                    <w:bottom w:w="30" w:type="dxa"/>
                     <w:right w:w="70" w:type="dxa"/>
                   </w:tcMar>
                 </w:tcPr>
@@ -10413,7 +10557,9 @@
               <w:rPr>
                 <w:rFonts w:ascii="Trade Gothic Next" w:hAnsi="Trade Gothic Next"/>
                 <w:b w:val="0"/>
+                <w:color w:val="14161B"/>
                 <w:sz w:val="17"/>
+                <w:u w:val="none"/>
               </w:rPr>
               <w:t>Phosphorus, longhand</w:t>
             </w:r>
@@ -10426,7 +10572,9 @@
               <w:rPr>
                 <w:rFonts w:ascii="Trade Gothic Next" w:hAnsi="Trade Gothic Next"/>
                 <w:b w:val="0"/>
+                <w:color w:val="14161B"/>
                 <w:sz w:val="17"/>
+                <w:u w:val="none"/>
               </w:rPr>
               <w:t>Sulfur, shorthand and 3p boxes</w:t>
             </w:r>
@@ -10439,7 +10587,9 @@
               <w:rPr>
                 <w:rFonts w:ascii="Trade Gothic Next" w:hAnsi="Trade Gothic Next"/>
                 <w:b w:val="0"/>
+                <w:color w:val="14161B"/>
                 <w:sz w:val="17"/>
+                <w:u w:val="none"/>
               </w:rPr>
               <w:t>Potassium, corrected</w:t>
             </w:r>
@@ -10647,7 +10797,9 @@
               <w:rPr>
                 <w:rFonts w:ascii="Trade Gothic Next" w:hAnsi="Trade Gothic Next"/>
                 <w:b w:val="0"/>
+                <w:color w:val="14161B"/>
                 <w:sz w:val="17"/>
+                <w:u w:val="none"/>
               </w:rPr>
               <w:t>Nitrogen error and the rule broken</w:t>
             </w:r>
@@ -10660,7 +10812,9 @@
               <w:rPr>
                 <w:rFonts w:ascii="Trade Gothic Next" w:hAnsi="Trade Gothic Next"/>
                 <w:b w:val="0"/>
+                <w:color w:val="14161B"/>
                 <w:sz w:val="17"/>
+                <w:u w:val="none"/>
               </w:rPr>
               <w:t>Neon error and the rule broken</w:t>
             </w:r>
@@ -11272,7 +11426,7 @@
                 <w:sz w:val="17"/>
                 <w:spacing w:val="26"/>
               </w:rPr>
-              <w:t>U2 / S2.4</w:t>
+              <w:t>U02 / S02.4</w:t>
             </w:r>
           </w:p>
           <w:p>
@@ -11405,7 +11559,9 @@
               <w:rPr>
                 <w:rFonts w:ascii="Trade Gothic Next" w:hAnsi="Trade Gothic Next"/>
                 <w:b w:val="0"/>
+                <w:color w:val="14161B"/>
                 <w:sz w:val="17"/>
+                <w:u w:val="none"/>
               </w:rPr>
               <w:t>Definition — valence electrons</w:t>
             </w:r>
@@ -11418,7 +11574,9 @@
               <w:rPr>
                 <w:rFonts w:ascii="Trade Gothic Next" w:hAnsi="Trade Gothic Next"/>
                 <w:b w:val="0"/>
+                <w:color w:val="14161B"/>
                 <w:sz w:val="17"/>
+                <w:u w:val="none"/>
               </w:rPr>
               <w:t>Chlorine, inner and outer</w:t>
             </w:r>
@@ -11431,7 +11589,9 @@
               <w:rPr>
                 <w:rFonts w:ascii="Trade Gothic Next" w:hAnsi="Trade Gothic Next"/>
                 <w:b w:val="0"/>
+                <w:color w:val="14161B"/>
                 <w:sz w:val="17"/>
+                <w:u w:val="none"/>
               </w:rPr>
               <w:t>Noble-gas outer electrons</w:t>
             </w:r>
@@ -11464,10 +11624,10 @@
           </w:p>
           <w:p>
             <w:pPr>
-              <w:spacing w:after="40" w:before="0"/>
               <w:pBdr>
                 <w:left w:val="single" w:sz="18" w:space="6" w:color="A3E635"/>
               </w:pBdr>
+              <w:spacing w:after="40" w:before="0"/>
             </w:pPr>
             <w:r>
               <w:rPr>
@@ -11757,7 +11917,9 @@
               <w:rPr>
                 <w:rFonts w:ascii="Trade Gothic Next" w:hAnsi="Trade Gothic Next"/>
                 <w:b w:val="0"/>
+                <w:color w:val="14161B"/>
                 <w:sz w:val="17"/>
+                <w:u w:val="none"/>
               </w:rPr>
               <w:t>Main groups</w:t>
             </w:r>
@@ -11770,7 +11932,9 @@
               <w:rPr>
                 <w:rFonts w:ascii="Trade Gothic Next" w:hAnsi="Trade Gothic Next"/>
                 <w:b w:val="0"/>
+                <w:color w:val="14161B"/>
                 <w:sz w:val="17"/>
+                <w:u w:val="none"/>
               </w:rPr>
               <w:t>Table — valence electrons by group</w:t>
             </w:r>
@@ -11783,7 +11947,9 @@
               <w:rPr>
                 <w:rFonts w:ascii="Trade Gothic Next" w:hAnsi="Trade Gothic Next"/>
                 <w:b w:val="0"/>
+                <w:color w:val="14161B"/>
                 <w:sz w:val="17"/>
+                <w:u w:val="none"/>
               </w:rPr>
               <w:t>The helium exception</w:t>
             </w:r>
@@ -12222,9 +12388,9 @@
                     <w:right w:val="single" w:sz="4" w:color="C8CDC2"/>
                   </w:tcBorders>
                   <w:tcMar>
-                    <w:top w:w="50" w:type="dxa"/>
+                    <w:top w:w="30" w:type="dxa"/>
                     <w:left w:w="70" w:type="dxa"/>
-                    <w:bottom w:w="50" w:type="dxa"/>
+                    <w:bottom w:w="30" w:type="dxa"/>
                     <w:right w:w="70" w:type="dxa"/>
                   </w:tcMar>
                 </w:tcPr>
@@ -12265,9 +12431,9 @@
                     <w:right w:val="single" w:sz="4" w:color="C8CDC2"/>
                   </w:tcBorders>
                   <w:tcMar>
-                    <w:top w:w="50" w:type="dxa"/>
+                    <w:top w:w="30" w:type="dxa"/>
                     <w:left w:w="70" w:type="dxa"/>
-                    <w:bottom w:w="50" w:type="dxa"/>
+                    <w:bottom w:w="30" w:type="dxa"/>
                     <w:right w:w="70" w:type="dxa"/>
                   </w:tcMar>
                 </w:tcPr>
@@ -12297,9 +12463,9 @@
                     <w:right w:val="single" w:sz="4" w:color="C8CDC2"/>
                   </w:tcBorders>
                   <w:tcMar>
-                    <w:top w:w="50" w:type="dxa"/>
+                    <w:top w:w="30" w:type="dxa"/>
                     <w:left w:w="70" w:type="dxa"/>
-                    <w:bottom w:w="50" w:type="dxa"/>
+                    <w:bottom w:w="30" w:type="dxa"/>
                     <w:right w:w="70" w:type="dxa"/>
                   </w:tcMar>
                 </w:tcPr>
@@ -12329,9 +12495,9 @@
                     <w:right w:val="single" w:sz="4" w:color="C8CDC2"/>
                   </w:tcBorders>
                   <w:tcMar>
-                    <w:top w:w="50" w:type="dxa"/>
+                    <w:top w:w="30" w:type="dxa"/>
                     <w:left w:w="70" w:type="dxa"/>
-                    <w:bottom w:w="50" w:type="dxa"/>
+                    <w:bottom w:w="30" w:type="dxa"/>
                     <w:right w:w="70" w:type="dxa"/>
                   </w:tcMar>
                 </w:tcPr>
@@ -12361,9 +12527,9 @@
                     <w:right w:val="single" w:sz="4" w:color="C8CDC2"/>
                   </w:tcBorders>
                   <w:tcMar>
-                    <w:top w:w="50" w:type="dxa"/>
+                    <w:top w:w="30" w:type="dxa"/>
                     <w:left w:w="70" w:type="dxa"/>
-                    <w:bottom w:w="50" w:type="dxa"/>
+                    <w:bottom w:w="30" w:type="dxa"/>
                     <w:right w:w="70" w:type="dxa"/>
                   </w:tcMar>
                 </w:tcPr>
@@ -12393,9 +12559,9 @@
                     <w:right w:val="single" w:sz="4" w:color="C8CDC2"/>
                   </w:tcBorders>
                   <w:tcMar>
-                    <w:top w:w="50" w:type="dxa"/>
+                    <w:top w:w="30" w:type="dxa"/>
                     <w:left w:w="70" w:type="dxa"/>
-                    <w:bottom w:w="50" w:type="dxa"/>
+                    <w:bottom w:w="30" w:type="dxa"/>
                     <w:right w:w="70" w:type="dxa"/>
                   </w:tcMar>
                 </w:tcPr>
@@ -12425,9 +12591,9 @@
                     <w:right w:val="single" w:sz="4" w:color="C8CDC2"/>
                   </w:tcBorders>
                   <w:tcMar>
-                    <w:top w:w="50" w:type="dxa"/>
+                    <w:top w:w="30" w:type="dxa"/>
                     <w:left w:w="70" w:type="dxa"/>
-                    <w:bottom w:w="50" w:type="dxa"/>
+                    <w:bottom w:w="30" w:type="dxa"/>
                     <w:right w:w="70" w:type="dxa"/>
                   </w:tcMar>
                 </w:tcPr>
@@ -12457,9 +12623,9 @@
                     <w:right w:val="single" w:sz="4" w:color="C8CDC2"/>
                   </w:tcBorders>
                   <w:tcMar>
-                    <w:top w:w="50" w:type="dxa"/>
+                    <w:top w:w="30" w:type="dxa"/>
                     <w:left w:w="70" w:type="dxa"/>
-                    <w:bottom w:w="50" w:type="dxa"/>
+                    <w:bottom w:w="30" w:type="dxa"/>
                     <w:right w:w="70" w:type="dxa"/>
                   </w:tcMar>
                 </w:tcPr>
@@ -12489,9 +12655,9 @@
                     <w:right w:val="single" w:sz="4" w:color="C8CDC2"/>
                   </w:tcBorders>
                   <w:tcMar>
-                    <w:top w:w="50" w:type="dxa"/>
+                    <w:top w:w="30" w:type="dxa"/>
                     <w:left w:w="70" w:type="dxa"/>
-                    <w:bottom w:w="50" w:type="dxa"/>
+                    <w:bottom w:w="30" w:type="dxa"/>
                     <w:right w:w="70" w:type="dxa"/>
                   </w:tcMar>
                 </w:tcPr>
@@ -12507,17 +12673,7 @@
                       <w:sz w:val="19"/>
                       <w:u w:val="single"/>
                     </w:rPr>
-                    <w:t>8</w:t>
-                  </w:r>
-                  <w:r>
-                    <w:rPr>
-                      <w:rFonts w:ascii="Trade Gothic Next" w:hAnsi="Trade Gothic Next"/>
-                      <w:b w:val="0"/>
-                      <w:color w:val="14161B"/>
-                      <w:sz w:val="19"/>
-                      <w:u w:val="none"/>
-                    </w:rPr>
-                    <w:t>*</w:t>
+                    <w:t>8*</w:t>
                   </w:r>
                 </w:p>
               </w:tc>
@@ -12587,7 +12743,9 @@
               <w:rPr>
                 <w:rFonts w:ascii="Trade Gothic Next" w:hAnsi="Trade Gothic Next"/>
                 <w:b w:val="0"/>
+                <w:color w:val="14161B"/>
                 <w:sz w:val="17"/>
+                <w:u w:val="none"/>
               </w:rPr>
               <w:t>Cation and anion, with an example each</w:t>
             </w:r>
@@ -12600,7 +12758,9 @@
               <w:rPr>
                 <w:rFonts w:ascii="Trade Gothic Next" w:hAnsi="Trade Gothic Next"/>
                 <w:b w:val="0"/>
+                <w:color w:val="14161B"/>
                 <w:sz w:val="17"/>
+                <w:u w:val="none"/>
               </w:rPr>
               <w:t>Counting electrons in an ion</w:t>
             </w:r>
@@ -12924,10 +13084,10 @@
           </w:p>
           <w:p>
             <w:pPr>
-              <w:spacing w:after="40" w:before="0"/>
               <w:pBdr>
                 <w:left w:val="single" w:sz="18" w:space="6" w:color="A3E635"/>
               </w:pBdr>
+              <w:spacing w:after="40" w:before="0"/>
             </w:pPr>
             <w:r>
               <w:rPr>
@@ -13012,7 +13172,9 @@
               <w:rPr>
                 <w:rFonts w:ascii="Trade Gothic Next" w:hAnsi="Trade Gothic Next"/>
                 <w:b w:val="0"/>
+                <w:color w:val="14161B"/>
                 <w:sz w:val="17"/>
+                <w:u w:val="none"/>
               </w:rPr>
               <w:t>Table — group, valence and common charge</w:t>
             </w:r>
@@ -13296,9 +13458,9 @@
                     <w:right w:val="single" w:sz="4" w:color="C8CDC2"/>
                   </w:tcBorders>
                   <w:tcMar>
-                    <w:top w:w="50" w:type="dxa"/>
+                    <w:top w:w="30" w:type="dxa"/>
                     <w:left w:w="70" w:type="dxa"/>
-                    <w:bottom w:w="50" w:type="dxa"/>
+                    <w:bottom w:w="30" w:type="dxa"/>
                     <w:right w:w="70" w:type="dxa"/>
                   </w:tcMar>
                 </w:tcPr>
@@ -13339,9 +13501,9 @@
                     <w:right w:val="single" w:sz="4" w:color="C8CDC2"/>
                   </w:tcBorders>
                   <w:tcMar>
-                    <w:top w:w="50" w:type="dxa"/>
+                    <w:top w:w="30" w:type="dxa"/>
                     <w:left w:w="70" w:type="dxa"/>
-                    <w:bottom w:w="50" w:type="dxa"/>
+                    <w:bottom w:w="30" w:type="dxa"/>
                     <w:right w:w="70" w:type="dxa"/>
                   </w:tcMar>
                 </w:tcPr>
@@ -13371,9 +13533,9 @@
                     <w:right w:val="single" w:sz="4" w:color="C8CDC2"/>
                   </w:tcBorders>
                   <w:tcMar>
-                    <w:top w:w="50" w:type="dxa"/>
+                    <w:top w:w="30" w:type="dxa"/>
                     <w:left w:w="70" w:type="dxa"/>
-                    <w:bottom w:w="50" w:type="dxa"/>
+                    <w:bottom w:w="30" w:type="dxa"/>
                     <w:right w:w="70" w:type="dxa"/>
                   </w:tcMar>
                 </w:tcPr>
@@ -13403,9 +13565,9 @@
                     <w:right w:val="single" w:sz="4" w:color="C8CDC2"/>
                   </w:tcBorders>
                   <w:tcMar>
-                    <w:top w:w="50" w:type="dxa"/>
+                    <w:top w:w="30" w:type="dxa"/>
                     <w:left w:w="70" w:type="dxa"/>
-                    <w:bottom w:w="50" w:type="dxa"/>
+                    <w:bottom w:w="30" w:type="dxa"/>
                     <w:right w:w="70" w:type="dxa"/>
                   </w:tcMar>
                 </w:tcPr>
@@ -13435,9 +13597,9 @@
                     <w:right w:val="single" w:sz="4" w:color="C8CDC2"/>
                   </w:tcBorders>
                   <w:tcMar>
-                    <w:top w:w="50" w:type="dxa"/>
+                    <w:top w:w="30" w:type="dxa"/>
                     <w:left w:w="70" w:type="dxa"/>
-                    <w:bottom w:w="50" w:type="dxa"/>
+                    <w:bottom w:w="30" w:type="dxa"/>
                     <w:right w:w="70" w:type="dxa"/>
                   </w:tcMar>
                 </w:tcPr>
@@ -13467,9 +13629,9 @@
                     <w:right w:val="single" w:sz="4" w:color="C8CDC2"/>
                   </w:tcBorders>
                   <w:tcMar>
-                    <w:top w:w="50" w:type="dxa"/>
+                    <w:top w:w="30" w:type="dxa"/>
                     <w:left w:w="70" w:type="dxa"/>
-                    <w:bottom w:w="50" w:type="dxa"/>
+                    <w:bottom w:w="30" w:type="dxa"/>
                     <w:right w:w="70" w:type="dxa"/>
                   </w:tcMar>
                 </w:tcPr>
@@ -13499,9 +13661,9 @@
                     <w:right w:val="single" w:sz="4" w:color="C8CDC2"/>
                   </w:tcBorders>
                   <w:tcMar>
-                    <w:top w:w="50" w:type="dxa"/>
+                    <w:top w:w="30" w:type="dxa"/>
                     <w:left w:w="70" w:type="dxa"/>
-                    <w:bottom w:w="50" w:type="dxa"/>
+                    <w:bottom w:w="30" w:type="dxa"/>
                     <w:right w:w="70" w:type="dxa"/>
                   </w:tcMar>
                 </w:tcPr>
@@ -13536,9 +13698,9 @@
                     <w:right w:val="single" w:sz="4" w:color="C8CDC2"/>
                   </w:tcBorders>
                   <w:tcMar>
-                    <w:top w:w="50" w:type="dxa"/>
+                    <w:top w:w="30" w:type="dxa"/>
                     <w:left w:w="70" w:type="dxa"/>
-                    <w:bottom w:w="50" w:type="dxa"/>
+                    <w:bottom w:w="30" w:type="dxa"/>
                     <w:right w:w="70" w:type="dxa"/>
                   </w:tcMar>
                 </w:tcPr>
@@ -13568,9 +13730,9 @@
                     <w:right w:val="single" w:sz="4" w:color="C8CDC2"/>
                   </w:tcBorders>
                   <w:tcMar>
-                    <w:top w:w="50" w:type="dxa"/>
+                    <w:top w:w="30" w:type="dxa"/>
                     <w:left w:w="70" w:type="dxa"/>
-                    <w:bottom w:w="50" w:type="dxa"/>
+                    <w:bottom w:w="30" w:type="dxa"/>
                     <w:right w:w="70" w:type="dxa"/>
                   </w:tcMar>
                 </w:tcPr>
@@ -13600,9 +13762,9 @@
                     <w:right w:val="single" w:sz="4" w:color="C8CDC2"/>
                   </w:tcBorders>
                   <w:tcMar>
-                    <w:top w:w="50" w:type="dxa"/>
+                    <w:top w:w="30" w:type="dxa"/>
                     <w:left w:w="70" w:type="dxa"/>
-                    <w:bottom w:w="50" w:type="dxa"/>
+                    <w:bottom w:w="30" w:type="dxa"/>
                     <w:right w:w="70" w:type="dxa"/>
                   </w:tcMar>
                 </w:tcPr>
@@ -13632,9 +13794,9 @@
                     <w:right w:val="single" w:sz="4" w:color="C8CDC2"/>
                   </w:tcBorders>
                   <w:tcMar>
-                    <w:top w:w="50" w:type="dxa"/>
+                    <w:top w:w="30" w:type="dxa"/>
                     <w:left w:w="70" w:type="dxa"/>
-                    <w:bottom w:w="50" w:type="dxa"/>
+                    <w:bottom w:w="30" w:type="dxa"/>
                     <w:right w:w="70" w:type="dxa"/>
                   </w:tcMar>
                 </w:tcPr>
@@ -13664,9 +13826,9 @@
                     <w:right w:val="single" w:sz="4" w:color="C8CDC2"/>
                   </w:tcBorders>
                   <w:tcMar>
-                    <w:top w:w="50" w:type="dxa"/>
+                    <w:top w:w="30" w:type="dxa"/>
                     <w:left w:w="70" w:type="dxa"/>
-                    <w:bottom w:w="50" w:type="dxa"/>
+                    <w:bottom w:w="30" w:type="dxa"/>
                     <w:right w:w="70" w:type="dxa"/>
                   </w:tcMar>
                 </w:tcPr>
@@ -13696,9 +13858,9 @@
                     <w:right w:val="single" w:sz="4" w:color="C8CDC2"/>
                   </w:tcBorders>
                   <w:tcMar>
-                    <w:top w:w="50" w:type="dxa"/>
+                    <w:top w:w="30" w:type="dxa"/>
                     <w:left w:w="70" w:type="dxa"/>
-                    <w:bottom w:w="50" w:type="dxa"/>
+                    <w:bottom w:w="30" w:type="dxa"/>
                     <w:right w:w="70" w:type="dxa"/>
                   </w:tcMar>
                 </w:tcPr>
@@ -13728,9 +13890,9 @@
                     <w:right w:val="single" w:sz="4" w:color="C8CDC2"/>
                   </w:tcBorders>
                   <w:tcMar>
-                    <w:top w:w="50" w:type="dxa"/>
+                    <w:top w:w="30" w:type="dxa"/>
                     <w:left w:w="70" w:type="dxa"/>
-                    <w:bottom w:w="50" w:type="dxa"/>
+                    <w:bottom w:w="30" w:type="dxa"/>
                     <w:right w:w="70" w:type="dxa"/>
                   </w:tcMar>
                 </w:tcPr>
@@ -13816,7 +13978,9 @@
               <w:rPr>
                 <w:rFonts w:ascii="Trade Gothic Next" w:hAnsi="Trade Gothic Next"/>
                 <w:b w:val="0"/>
+                <w:color w:val="14161B"/>
                 <w:sz w:val="17"/>
+                <w:u w:val="none"/>
               </w:rPr>
               <w:t>Table — Mg, Al, S, Br with change, ion and noble gas</w:t>
             </w:r>
@@ -14081,9 +14245,9 @@
                     <w:right w:val="single" w:sz="4" w:color="C8CDC2"/>
                   </w:tcBorders>
                   <w:tcMar>
-                    <w:top w:w="50" w:type="dxa"/>
+                    <w:top w:w="30" w:type="dxa"/>
                     <w:left w:w="70" w:type="dxa"/>
-                    <w:bottom w:w="50" w:type="dxa"/>
+                    <w:bottom w:w="30" w:type="dxa"/>
                     <w:right w:w="70" w:type="dxa"/>
                   </w:tcMar>
                 </w:tcPr>
@@ -14113,9 +14277,9 @@
                     <w:right w:val="single" w:sz="4" w:color="C8CDC2"/>
                   </w:tcBorders>
                   <w:tcMar>
-                    <w:top w:w="50" w:type="dxa"/>
+                    <w:top w:w="30" w:type="dxa"/>
                     <w:left w:w="70" w:type="dxa"/>
-                    <w:bottom w:w="50" w:type="dxa"/>
+                    <w:bottom w:w="30" w:type="dxa"/>
                     <w:right w:w="70" w:type="dxa"/>
                   </w:tcMar>
                 </w:tcPr>
@@ -14145,9 +14309,9 @@
                     <w:right w:val="single" w:sz="4" w:color="C8CDC2"/>
                   </w:tcBorders>
                   <w:tcMar>
-                    <w:top w:w="50" w:type="dxa"/>
+                    <w:top w:w="30" w:type="dxa"/>
                     <w:left w:w="70" w:type="dxa"/>
-                    <w:bottom w:w="50" w:type="dxa"/>
+                    <w:bottom w:w="30" w:type="dxa"/>
                     <w:right w:w="70" w:type="dxa"/>
                   </w:tcMar>
                 </w:tcPr>
@@ -14177,9 +14341,9 @@
                     <w:right w:val="single" w:sz="4" w:color="C8CDC2"/>
                   </w:tcBorders>
                   <w:tcMar>
-                    <w:top w:w="50" w:type="dxa"/>
+                    <w:top w:w="30" w:type="dxa"/>
                     <w:left w:w="70" w:type="dxa"/>
-                    <w:bottom w:w="50" w:type="dxa"/>
+                    <w:bottom w:w="30" w:type="dxa"/>
                     <w:right w:w="70" w:type="dxa"/>
                   </w:tcMar>
                 </w:tcPr>
@@ -14209,9 +14373,9 @@
                     <w:right w:val="single" w:sz="4" w:color="C8CDC2"/>
                   </w:tcBorders>
                   <w:tcMar>
-                    <w:top w:w="50" w:type="dxa"/>
+                    <w:top w:w="30" w:type="dxa"/>
                     <w:left w:w="70" w:type="dxa"/>
-                    <w:bottom w:w="50" w:type="dxa"/>
+                    <w:bottom w:w="30" w:type="dxa"/>
                     <w:right w:w="70" w:type="dxa"/>
                   </w:tcMar>
                 </w:tcPr>
@@ -14252,9 +14416,9 @@
                     <w:right w:val="single" w:sz="4" w:color="C8CDC2"/>
                   </w:tcBorders>
                   <w:tcMar>
-                    <w:top w:w="50" w:type="dxa"/>
+                    <w:top w:w="30" w:type="dxa"/>
                     <w:left w:w="70" w:type="dxa"/>
-                    <w:bottom w:w="50" w:type="dxa"/>
+                    <w:bottom w:w="30" w:type="dxa"/>
                     <w:right w:w="70" w:type="dxa"/>
                   </w:tcMar>
                 </w:tcPr>
@@ -14289,9 +14453,9 @@
                     <w:right w:val="single" w:sz="4" w:color="C8CDC2"/>
                   </w:tcBorders>
                   <w:tcMar>
-                    <w:top w:w="50" w:type="dxa"/>
+                    <w:top w:w="30" w:type="dxa"/>
                     <w:left w:w="70" w:type="dxa"/>
-                    <w:bottom w:w="50" w:type="dxa"/>
+                    <w:bottom w:w="30" w:type="dxa"/>
                     <w:right w:w="70" w:type="dxa"/>
                   </w:tcMar>
                 </w:tcPr>
@@ -14321,9 +14485,9 @@
                     <w:right w:val="single" w:sz="4" w:color="C8CDC2"/>
                   </w:tcBorders>
                   <w:tcMar>
-                    <w:top w:w="50" w:type="dxa"/>
+                    <w:top w:w="30" w:type="dxa"/>
                     <w:left w:w="70" w:type="dxa"/>
-                    <w:bottom w:w="50" w:type="dxa"/>
+                    <w:bottom w:w="30" w:type="dxa"/>
                     <w:right w:w="70" w:type="dxa"/>
                   </w:tcMar>
                 </w:tcPr>
@@ -14353,9 +14517,9 @@
                     <w:right w:val="single" w:sz="4" w:color="C8CDC2"/>
                   </w:tcBorders>
                   <w:tcMar>
-                    <w:top w:w="50" w:type="dxa"/>
+                    <w:top w:w="30" w:type="dxa"/>
                     <w:left w:w="70" w:type="dxa"/>
-                    <w:bottom w:w="50" w:type="dxa"/>
+                    <w:bottom w:w="30" w:type="dxa"/>
                     <w:right w:w="70" w:type="dxa"/>
                   </w:tcMar>
                 </w:tcPr>
@@ -14385,9 +14549,9 @@
                     <w:right w:val="single" w:sz="4" w:color="C8CDC2"/>
                   </w:tcBorders>
                   <w:tcMar>
-                    <w:top w:w="50" w:type="dxa"/>
+                    <w:top w:w="30" w:type="dxa"/>
                     <w:left w:w="70" w:type="dxa"/>
-                    <w:bottom w:w="50" w:type="dxa"/>
+                    <w:bottom w:w="30" w:type="dxa"/>
                     <w:right w:w="70" w:type="dxa"/>
                   </w:tcMar>
                 </w:tcPr>
@@ -14417,9 +14581,9 @@
                     <w:right w:val="single" w:sz="4" w:color="C8CDC2"/>
                   </w:tcBorders>
                   <w:tcMar>
-                    <w:top w:w="50" w:type="dxa"/>
+                    <w:top w:w="30" w:type="dxa"/>
                     <w:left w:w="70" w:type="dxa"/>
-                    <w:bottom w:w="50" w:type="dxa"/>
+                    <w:bottom w:w="30" w:type="dxa"/>
                     <w:right w:w="70" w:type="dxa"/>
                   </w:tcMar>
                 </w:tcPr>
@@ -14460,9 +14624,9 @@
                     <w:right w:val="single" w:sz="4" w:color="C8CDC2"/>
                   </w:tcBorders>
                   <w:tcMar>
-                    <w:top w:w="50" w:type="dxa"/>
+                    <w:top w:w="30" w:type="dxa"/>
                     <w:left w:w="70" w:type="dxa"/>
-                    <w:bottom w:w="50" w:type="dxa"/>
+                    <w:bottom w:w="30" w:type="dxa"/>
                     <w:right w:w="70" w:type="dxa"/>
                   </w:tcMar>
                 </w:tcPr>
@@ -14497,9 +14661,9 @@
                     <w:right w:val="single" w:sz="4" w:color="C8CDC2"/>
                   </w:tcBorders>
                   <w:tcMar>
-                    <w:top w:w="50" w:type="dxa"/>
+                    <w:top w:w="30" w:type="dxa"/>
                     <w:left w:w="70" w:type="dxa"/>
-                    <w:bottom w:w="50" w:type="dxa"/>
+                    <w:bottom w:w="30" w:type="dxa"/>
                     <w:right w:w="70" w:type="dxa"/>
                   </w:tcMar>
                 </w:tcPr>
@@ -14529,9 +14693,9 @@
                     <w:right w:val="single" w:sz="4" w:color="C8CDC2"/>
                   </w:tcBorders>
                   <w:tcMar>
-                    <w:top w:w="50" w:type="dxa"/>
+                    <w:top w:w="30" w:type="dxa"/>
                     <w:left w:w="70" w:type="dxa"/>
-                    <w:bottom w:w="50" w:type="dxa"/>
+                    <w:bottom w:w="30" w:type="dxa"/>
                     <w:right w:w="70" w:type="dxa"/>
                   </w:tcMar>
                 </w:tcPr>
@@ -14561,9 +14725,9 @@
                     <w:right w:val="single" w:sz="4" w:color="C8CDC2"/>
                   </w:tcBorders>
                   <w:tcMar>
-                    <w:top w:w="50" w:type="dxa"/>
+                    <w:top w:w="30" w:type="dxa"/>
                     <w:left w:w="70" w:type="dxa"/>
-                    <w:bottom w:w="50" w:type="dxa"/>
+                    <w:bottom w:w="30" w:type="dxa"/>
                     <w:right w:w="70" w:type="dxa"/>
                   </w:tcMar>
                 </w:tcPr>
@@ -14593,9 +14757,9 @@
                     <w:right w:val="single" w:sz="4" w:color="C8CDC2"/>
                   </w:tcBorders>
                   <w:tcMar>
-                    <w:top w:w="50" w:type="dxa"/>
+                    <w:top w:w="30" w:type="dxa"/>
                     <w:left w:w="70" w:type="dxa"/>
-                    <w:bottom w:w="50" w:type="dxa"/>
+                    <w:bottom w:w="30" w:type="dxa"/>
                     <w:right w:w="70" w:type="dxa"/>
                   </w:tcMar>
                 </w:tcPr>
@@ -14625,9 +14789,9 @@
                     <w:right w:val="single" w:sz="4" w:color="C8CDC2"/>
                   </w:tcBorders>
                   <w:tcMar>
-                    <w:top w:w="50" w:type="dxa"/>
+                    <w:top w:w="30" w:type="dxa"/>
                     <w:left w:w="70" w:type="dxa"/>
-                    <w:bottom w:w="50" w:type="dxa"/>
+                    <w:bottom w:w="30" w:type="dxa"/>
                     <w:right w:w="70" w:type="dxa"/>
                   </w:tcMar>
                 </w:tcPr>
@@ -14668,9 +14832,9 @@
                     <w:right w:val="single" w:sz="4" w:color="C8CDC2"/>
                   </w:tcBorders>
                   <w:tcMar>
-                    <w:top w:w="50" w:type="dxa"/>
+                    <w:top w:w="30" w:type="dxa"/>
                     <w:left w:w="70" w:type="dxa"/>
-                    <w:bottom w:w="50" w:type="dxa"/>
+                    <w:bottom w:w="30" w:type="dxa"/>
                     <w:right w:w="70" w:type="dxa"/>
                   </w:tcMar>
                 </w:tcPr>
@@ -14705,9 +14869,9 @@
                     <w:right w:val="single" w:sz="4" w:color="C8CDC2"/>
                   </w:tcBorders>
                   <w:tcMar>
-                    <w:top w:w="50" w:type="dxa"/>
+                    <w:top w:w="30" w:type="dxa"/>
                     <w:left w:w="70" w:type="dxa"/>
-                    <w:bottom w:w="50" w:type="dxa"/>
+                    <w:bottom w:w="30" w:type="dxa"/>
                     <w:right w:w="70" w:type="dxa"/>
                   </w:tcMar>
                 </w:tcPr>
@@ -14737,9 +14901,9 @@
                     <w:right w:val="single" w:sz="4" w:color="C8CDC2"/>
                   </w:tcBorders>
                   <w:tcMar>
-                    <w:top w:w="50" w:type="dxa"/>
+                    <w:top w:w="30" w:type="dxa"/>
                     <w:left w:w="70" w:type="dxa"/>
-                    <w:bottom w:w="50" w:type="dxa"/>
+                    <w:bottom w:w="30" w:type="dxa"/>
                     <w:right w:w="70" w:type="dxa"/>
                   </w:tcMar>
                 </w:tcPr>
@@ -14769,9 +14933,9 @@
                     <w:right w:val="single" w:sz="4" w:color="C8CDC2"/>
                   </w:tcBorders>
                   <w:tcMar>
-                    <w:top w:w="50" w:type="dxa"/>
+                    <w:top w:w="30" w:type="dxa"/>
                     <w:left w:w="70" w:type="dxa"/>
-                    <w:bottom w:w="50" w:type="dxa"/>
+                    <w:bottom w:w="30" w:type="dxa"/>
                     <w:right w:w="70" w:type="dxa"/>
                   </w:tcMar>
                 </w:tcPr>
@@ -14801,9 +14965,9 @@
                     <w:right w:val="single" w:sz="4" w:color="C8CDC2"/>
                   </w:tcBorders>
                   <w:tcMar>
-                    <w:top w:w="50" w:type="dxa"/>
+                    <w:top w:w="30" w:type="dxa"/>
                     <w:left w:w="70" w:type="dxa"/>
-                    <w:bottom w:w="50" w:type="dxa"/>
+                    <w:bottom w:w="30" w:type="dxa"/>
                     <w:right w:w="70" w:type="dxa"/>
                   </w:tcMar>
                 </w:tcPr>
@@ -14833,9 +14997,9 @@
                     <w:right w:val="single" w:sz="4" w:color="C8CDC2"/>
                   </w:tcBorders>
                   <w:tcMar>
-                    <w:top w:w="50" w:type="dxa"/>
+                    <w:top w:w="30" w:type="dxa"/>
                     <w:left w:w="70" w:type="dxa"/>
-                    <w:bottom w:w="50" w:type="dxa"/>
+                    <w:bottom w:w="30" w:type="dxa"/>
                     <w:right w:w="70" w:type="dxa"/>
                   </w:tcMar>
                 </w:tcPr>
@@ -14876,9 +15040,9 @@
                     <w:right w:val="single" w:sz="4" w:color="C8CDC2"/>
                   </w:tcBorders>
                   <w:tcMar>
-                    <w:top w:w="50" w:type="dxa"/>
+                    <w:top w:w="30" w:type="dxa"/>
                     <w:left w:w="70" w:type="dxa"/>
-                    <w:bottom w:w="50" w:type="dxa"/>
+                    <w:bottom w:w="30" w:type="dxa"/>
                     <w:right w:w="70" w:type="dxa"/>
                   </w:tcMar>
                 </w:tcPr>
@@ -14964,7 +15128,9 @@
               <w:rPr>
                 <w:rFonts w:ascii="Trade Gothic Next" w:hAnsi="Trade Gothic Next"/>
                 <w:b w:val="0"/>
+                <w:color w:val="14161B"/>
                 <w:sz w:val="17"/>
+                <w:u w:val="none"/>
               </w:rPr>
               <w:t>Order the electrons leave</w:t>
             </w:r>
@@ -14977,7 +15143,9 @@
               <w:rPr>
                 <w:rFonts w:ascii="Trade Gothic Next" w:hAnsi="Trade Gothic Next"/>
                 <w:b w:val="0"/>
+                <w:color w:val="14161B"/>
                 <w:sz w:val="17"/>
+                <w:u w:val="none"/>
               </w:rPr>
               <w:t>Table — Fe, Cu, Zn ions</w:t>
             </w:r>
@@ -15010,10 +15178,10 @@
           </w:p>
           <w:p>
             <w:pPr>
-              <w:spacing w:after="40" w:before="0"/>
               <w:pBdr>
                 <w:left w:val="single" w:sz="18" w:space="6" w:color="A3E635"/>
               </w:pBdr>
+              <w:spacing w:after="40" w:before="0"/>
             </w:pPr>
             <w:r>
               <w:rPr>
@@ -15229,9 +15397,9 @@
                     <w:right w:val="single" w:sz="4" w:color="C8CDC2"/>
                   </w:tcBorders>
                   <w:tcMar>
-                    <w:top w:w="50" w:type="dxa"/>
+                    <w:top w:w="30" w:type="dxa"/>
                     <w:left w:w="70" w:type="dxa"/>
-                    <w:bottom w:w="50" w:type="dxa"/>
+                    <w:bottom w:w="30" w:type="dxa"/>
                     <w:right w:w="70" w:type="dxa"/>
                   </w:tcMar>
                 </w:tcPr>
@@ -15261,9 +15429,9 @@
                     <w:right w:val="single" w:sz="4" w:color="C8CDC2"/>
                   </w:tcBorders>
                   <w:tcMar>
-                    <w:top w:w="50" w:type="dxa"/>
+                    <w:top w:w="30" w:type="dxa"/>
                     <w:left w:w="70" w:type="dxa"/>
-                    <w:bottom w:w="50" w:type="dxa"/>
+                    <w:bottom w:w="30" w:type="dxa"/>
                     <w:right w:w="70" w:type="dxa"/>
                   </w:tcMar>
                 </w:tcPr>
@@ -15325,9 +15493,9 @@
                     <w:right w:val="single" w:sz="4" w:color="C8CDC2"/>
                   </w:tcBorders>
                   <w:tcMar>
-                    <w:top w:w="50" w:type="dxa"/>
+                    <w:top w:w="30" w:type="dxa"/>
                     <w:left w:w="70" w:type="dxa"/>
-                    <w:bottom w:w="50" w:type="dxa"/>
+                    <w:bottom w:w="30" w:type="dxa"/>
                     <w:right w:w="70" w:type="dxa"/>
                   </w:tcMar>
                 </w:tcPr>
@@ -15382,9 +15550,9 @@
                     <w:right w:val="single" w:sz="4" w:color="C8CDC2"/>
                   </w:tcBorders>
                   <w:tcMar>
-                    <w:top w:w="50" w:type="dxa"/>
+                    <w:top w:w="30" w:type="dxa"/>
                     <w:left w:w="70" w:type="dxa"/>
-                    <w:bottom w:w="50" w:type="dxa"/>
+                    <w:bottom w:w="30" w:type="dxa"/>
                     <w:right w:w="70" w:type="dxa"/>
                   </w:tcMar>
                 </w:tcPr>
@@ -15414,9 +15582,9 @@
                     <w:right w:val="single" w:sz="4" w:color="C8CDC2"/>
                   </w:tcBorders>
                   <w:tcMar>
-                    <w:top w:w="50" w:type="dxa"/>
+                    <w:top w:w="30" w:type="dxa"/>
                     <w:left w:w="70" w:type="dxa"/>
-                    <w:bottom w:w="50" w:type="dxa"/>
+                    <w:bottom w:w="30" w:type="dxa"/>
                     <w:right w:w="70" w:type="dxa"/>
                   </w:tcMar>
                 </w:tcPr>
@@ -15478,9 +15646,9 @@
                     <w:right w:val="single" w:sz="4" w:color="C8CDC2"/>
                   </w:tcBorders>
                   <w:tcMar>
-                    <w:top w:w="50" w:type="dxa"/>
+                    <w:top w:w="30" w:type="dxa"/>
                     <w:left w:w="70" w:type="dxa"/>
-                    <w:bottom w:w="50" w:type="dxa"/>
+                    <w:bottom w:w="30" w:type="dxa"/>
                     <w:right w:w="70" w:type="dxa"/>
                   </w:tcMar>
                 </w:tcPr>
@@ -15535,9 +15703,9 @@
                     <w:right w:val="single" w:sz="4" w:color="C8CDC2"/>
                   </w:tcBorders>
                   <w:tcMar>
-                    <w:top w:w="50" w:type="dxa"/>
+                    <w:top w:w="30" w:type="dxa"/>
                     <w:left w:w="70" w:type="dxa"/>
-                    <w:bottom w:w="50" w:type="dxa"/>
+                    <w:bottom w:w="30" w:type="dxa"/>
                     <w:right w:w="70" w:type="dxa"/>
                   </w:tcMar>
                 </w:tcPr>
@@ -15567,9 +15735,9 @@
                     <w:right w:val="single" w:sz="4" w:color="C8CDC2"/>
                   </w:tcBorders>
                   <w:tcMar>
-                    <w:top w:w="50" w:type="dxa"/>
+                    <w:top w:w="30" w:type="dxa"/>
                     <w:left w:w="70" w:type="dxa"/>
-                    <w:bottom w:w="50" w:type="dxa"/>
+                    <w:bottom w:w="30" w:type="dxa"/>
                     <w:right w:w="70" w:type="dxa"/>
                   </w:tcMar>
                 </w:tcPr>
@@ -15610,9 +15778,9 @@
                     <w:right w:val="single" w:sz="4" w:color="C8CDC2"/>
                   </w:tcBorders>
                   <w:tcMar>
-                    <w:top w:w="50" w:type="dxa"/>
+                    <w:top w:w="30" w:type="dxa"/>
                     <w:left w:w="70" w:type="dxa"/>
-                    <w:bottom w:w="50" w:type="dxa"/>
+                    <w:bottom w:w="30" w:type="dxa"/>
                     <w:right w:w="70" w:type="dxa"/>
                   </w:tcMar>
                 </w:tcPr>
@@ -15698,7 +15866,9 @@
               <w:rPr>
                 <w:rFonts w:ascii="Trade Gothic Next" w:hAnsi="Trade Gothic Next"/>
                 <w:b w:val="0"/>
+                <w:color w:val="14161B"/>
                 <w:sz w:val="17"/>
+                <w:u w:val="none"/>
               </w:rPr>
               <w:t>Definition — isoelectronic</w:t>
             </w:r>
@@ -15711,7 +15881,9 @@
               <w:rPr>
                 <w:rFonts w:ascii="Trade Gothic Next" w:hAnsi="Trade Gothic Next"/>
                 <w:b w:val="0"/>
+                <w:color w:val="14161B"/>
                 <w:sz w:val="17"/>
+                <w:u w:val="none"/>
               </w:rPr>
               <w:t>The five species with 10 electrons</w:t>
             </w:r>
@@ -15724,7 +15896,9 @@
               <w:rPr>
                 <w:rFonts w:ascii="Trade Gothic Next" w:hAnsi="Trade Gothic Next"/>
                 <w:b w:val="0"/>
+                <w:color w:val="14161B"/>
                 <w:sz w:val="17"/>
+                <w:u w:val="none"/>
               </w:rPr>
               <w:t>Reason they are still different elements</w:t>
             </w:r>
@@ -15757,10 +15931,10 @@
           </w:p>
           <w:p>
             <w:pPr>
-              <w:spacing w:after="40" w:before="0"/>
               <w:pBdr>
                 <w:left w:val="single" w:sz="18" w:space="6" w:color="A3E635"/>
               </w:pBdr>
+              <w:spacing w:after="40" w:before="0"/>
             </w:pPr>
             <w:r>
               <w:rPr>
@@ -16073,7 +16247,7 @@
                 <w:sz w:val="19"/>
                 <w:u w:val="none"/>
               </w:rPr>
-              <w:t xml:space="preserve"> electrons, and a main-group atom's count matches its </w:t>
+              <w:t xml:space="preserve"> electrons, and for groups 13–18 the count is the group number minus </w:t>
             </w:r>
             <w:r>
               <w:rPr>
@@ -16083,7 +16257,7 @@
                 <w:sz w:val="19"/>
                 <w:u w:val="single"/>
               </w:rPr>
-              <w:t>group</w:t>
+              <w:t>10</w:t>
             </w:r>
             <w:r>
               <w:rPr>
@@ -16458,7 +16632,7 @@
                 <w:sz w:val="17"/>
                 <w:spacing w:val="26"/>
               </w:rPr>
-              <w:t>U2 / S2.5</w:t>
+              <w:t>U02 / S02.5</w:t>
             </w:r>
           </w:p>
           <w:p>
@@ -16591,7 +16765,9 @@
               <w:rPr>
                 <w:rFonts w:ascii="Trade Gothic Next" w:hAnsi="Trade Gothic Next"/>
                 <w:b w:val="0"/>
+                <w:color w:val="14161B"/>
                 <w:sz w:val="17"/>
+                <w:u w:val="none"/>
               </w:rPr>
               <w:t>Definition — photon</w:t>
             </w:r>
@@ -16604,7 +16780,9 @@
               <w:rPr>
                 <w:rFonts w:ascii="Trade Gothic Next" w:hAnsi="Trade Gothic Next"/>
                 <w:b w:val="0"/>
+                <w:color w:val="14161B"/>
                 <w:sz w:val="17"/>
+                <w:u w:val="none"/>
               </w:rPr>
               <w:t>Absorption, with direction of the electron</w:t>
             </w:r>
@@ -16617,7 +16795,9 @@
               <w:rPr>
                 <w:rFonts w:ascii="Trade Gothic Next" w:hAnsi="Trade Gothic Next"/>
                 <w:b w:val="0"/>
+                <w:color w:val="14161B"/>
                 <w:sz w:val="17"/>
+                <w:u w:val="none"/>
               </w:rPr>
               <w:t>Emission, with direction of the electron</w:t>
             </w:r>
@@ -16630,7 +16810,9 @@
               <w:rPr>
                 <w:rFonts w:ascii="Trade Gothic Next" w:hAnsi="Trade Gothic Next"/>
                 <w:b w:val="0"/>
+                <w:color w:val="14161B"/>
                 <w:sz w:val="17"/>
+                <w:u w:val="none"/>
               </w:rPr>
               <w:t>Photon energy rule</w:t>
             </w:r>
@@ -16663,10 +16845,10 @@
           </w:p>
           <w:p>
             <w:pPr>
-              <w:spacing w:after="40" w:before="0"/>
               <w:pBdr>
                 <w:left w:val="single" w:sz="18" w:space="6" w:color="A3E635"/>
               </w:pBdr>
+              <w:spacing w:after="40" w:before="0"/>
             </w:pPr>
             <w:r>
               <w:rPr>
@@ -16771,10 +16953,10 @@
           </w:p>
           <w:p>
             <w:pPr>
-              <w:spacing w:after="40" w:before="0"/>
               <w:pBdr>
                 <w:left w:val="single" w:sz="18" w:space="6" w:color="A3E635"/>
               </w:pBdr>
+              <w:spacing w:after="40" w:before="0"/>
             </w:pPr>
             <w:r>
               <w:rPr>
@@ -16859,7 +17041,9 @@
               <w:rPr>
                 <w:rFonts w:ascii="Trade Gothic Next" w:hAnsi="Trade Gothic Next"/>
                 <w:b w:val="0"/>
+                <w:color w:val="14161B"/>
                 <w:sz w:val="17"/>
+                <w:u w:val="none"/>
               </w:rPr>
               <w:t>The three drops compared</w:t>
             </w:r>
@@ -16872,7 +17056,9 @@
               <w:rPr>
                 <w:rFonts w:ascii="Trade Gothic Next" w:hAnsi="Trade Gothic Next"/>
                 <w:b w:val="0"/>
+                <w:color w:val="14161B"/>
                 <w:sz w:val="17"/>
+                <w:u w:val="none"/>
               </w:rPr>
               <w:t>Largest gap of the three</w:t>
             </w:r>
@@ -17025,7 +17211,9 @@
               <w:rPr>
                 <w:rFonts w:ascii="Trade Gothic Next" w:hAnsi="Trade Gothic Next"/>
                 <w:b w:val="0"/>
+                <w:color w:val="14161B"/>
                 <w:sz w:val="17"/>
+                <w:u w:val="none"/>
               </w:rPr>
               <w:t>Table — violet against red</w:t>
             </w:r>
@@ -17038,7 +17226,9 @@
               <w:rPr>
                 <w:rFonts w:ascii="Trade Gothic Next" w:hAnsi="Trade Gothic Next"/>
                 <w:b w:val="0"/>
+                <w:color w:val="14161B"/>
                 <w:sz w:val="17"/>
+                <w:u w:val="none"/>
               </w:rPr>
               <w:t>Visible range</w:t>
             </w:r>
@@ -17071,10 +17261,10 @@
           </w:p>
           <w:p>
             <w:pPr>
-              <w:spacing w:after="40" w:before="0"/>
               <w:pBdr>
                 <w:left w:val="single" w:sz="18" w:space="6" w:color="A3E635"/>
               </w:pBdr>
+              <w:spacing w:after="40" w:before="0"/>
             </w:pPr>
             <w:r>
               <w:rPr>
@@ -17300,9 +17490,9 @@
                     <w:right w:val="single" w:sz="4" w:color="C8CDC2"/>
                   </w:tcBorders>
                   <w:tcMar>
-                    <w:top w:w="50" w:type="dxa"/>
+                    <w:top w:w="30" w:type="dxa"/>
                     <w:left w:w="70" w:type="dxa"/>
-                    <w:bottom w:w="50" w:type="dxa"/>
+                    <w:bottom w:w="30" w:type="dxa"/>
                     <w:right w:w="70" w:type="dxa"/>
                   </w:tcMar>
                 </w:tcPr>
@@ -17332,9 +17522,9 @@
                     <w:right w:val="single" w:sz="4" w:color="C8CDC2"/>
                   </w:tcBorders>
                   <w:tcMar>
-                    <w:top w:w="50" w:type="dxa"/>
+                    <w:top w:w="30" w:type="dxa"/>
                     <w:left w:w="70" w:type="dxa"/>
-                    <w:bottom w:w="50" w:type="dxa"/>
+                    <w:bottom w:w="30" w:type="dxa"/>
                     <w:right w:w="70" w:type="dxa"/>
                   </w:tcMar>
                 </w:tcPr>
@@ -17364,9 +17554,9 @@
                     <w:right w:val="single" w:sz="4" w:color="C8CDC2"/>
                   </w:tcBorders>
                   <w:tcMar>
-                    <w:top w:w="50" w:type="dxa"/>
+                    <w:top w:w="30" w:type="dxa"/>
                     <w:left w:w="70" w:type="dxa"/>
-                    <w:bottom w:w="50" w:type="dxa"/>
+                    <w:bottom w:w="30" w:type="dxa"/>
                     <w:right w:w="70" w:type="dxa"/>
                   </w:tcMar>
                 </w:tcPr>
@@ -17401,9 +17591,9 @@
                     <w:right w:val="single" w:sz="4" w:color="C8CDC2"/>
                   </w:tcBorders>
                   <w:tcMar>
-                    <w:top w:w="50" w:type="dxa"/>
+                    <w:top w:w="30" w:type="dxa"/>
                     <w:left w:w="70" w:type="dxa"/>
-                    <w:bottom w:w="50" w:type="dxa"/>
+                    <w:bottom w:w="30" w:type="dxa"/>
                     <w:right w:w="70" w:type="dxa"/>
                   </w:tcMar>
                 </w:tcPr>
@@ -17433,9 +17623,9 @@
                     <w:right w:val="single" w:sz="4" w:color="C8CDC2"/>
                   </w:tcBorders>
                   <w:tcMar>
-                    <w:top w:w="50" w:type="dxa"/>
+                    <w:top w:w="30" w:type="dxa"/>
                     <w:left w:w="70" w:type="dxa"/>
-                    <w:bottom w:w="50" w:type="dxa"/>
+                    <w:bottom w:w="30" w:type="dxa"/>
                     <w:right w:w="70" w:type="dxa"/>
                   </w:tcMar>
                 </w:tcPr>
@@ -17465,9 +17655,9 @@
                     <w:right w:val="single" w:sz="4" w:color="C8CDC2"/>
                   </w:tcBorders>
                   <w:tcMar>
-                    <w:top w:w="50" w:type="dxa"/>
+                    <w:top w:w="30" w:type="dxa"/>
                     <w:left w:w="70" w:type="dxa"/>
-                    <w:bottom w:w="50" w:type="dxa"/>
+                    <w:bottom w:w="30" w:type="dxa"/>
                     <w:right w:w="70" w:type="dxa"/>
                   </w:tcMar>
                 </w:tcPr>
@@ -17553,7 +17743,9 @@
               <w:rPr>
                 <w:rFonts w:ascii="Trade Gothic Next" w:hAnsi="Trade Gothic Next"/>
                 <w:b w:val="0"/>
+                <w:color w:val="14161B"/>
                 <w:sz w:val="17"/>
+                <w:u w:val="none"/>
               </w:rPr>
               <w:t>Definition — spectrum</w:t>
             </w:r>
@@ -17566,7 +17758,9 @@
               <w:rPr>
                 <w:rFonts w:ascii="Trade Gothic Next" w:hAnsi="Trade Gothic Next"/>
                 <w:b w:val="0"/>
+                <w:color w:val="14161B"/>
                 <w:sz w:val="17"/>
+                <w:u w:val="none"/>
               </w:rPr>
               <w:t>Table — three kinds of spectra</w:t>
             </w:r>
@@ -17755,9 +17949,9 @@
                     <w:right w:val="single" w:sz="4" w:color="C8CDC2"/>
                   </w:tcBorders>
                   <w:tcMar>
-                    <w:top w:w="50" w:type="dxa"/>
+                    <w:top w:w="30" w:type="dxa"/>
                     <w:left w:w="70" w:type="dxa"/>
-                    <w:bottom w:w="50" w:type="dxa"/>
+                    <w:bottom w:w="30" w:type="dxa"/>
                     <w:right w:w="70" w:type="dxa"/>
                   </w:tcMar>
                 </w:tcPr>
@@ -17787,9 +17981,9 @@
                     <w:right w:val="single" w:sz="4" w:color="C8CDC2"/>
                   </w:tcBorders>
                   <w:tcMar>
-                    <w:top w:w="50" w:type="dxa"/>
+                    <w:top w:w="30" w:type="dxa"/>
                     <w:left w:w="70" w:type="dxa"/>
-                    <w:bottom w:w="50" w:type="dxa"/>
+                    <w:bottom w:w="30" w:type="dxa"/>
                     <w:right w:w="70" w:type="dxa"/>
                   </w:tcMar>
                 </w:tcPr>
@@ -17824,9 +18018,9 @@
                     <w:right w:val="single" w:sz="4" w:color="C8CDC2"/>
                   </w:tcBorders>
                   <w:tcMar>
-                    <w:top w:w="50" w:type="dxa"/>
+                    <w:top w:w="30" w:type="dxa"/>
                     <w:left w:w="70" w:type="dxa"/>
-                    <w:bottom w:w="50" w:type="dxa"/>
+                    <w:bottom w:w="30" w:type="dxa"/>
                     <w:right w:w="70" w:type="dxa"/>
                   </w:tcMar>
                 </w:tcPr>
@@ -17856,9 +18050,9 @@
                     <w:right w:val="single" w:sz="4" w:color="C8CDC2"/>
                   </w:tcBorders>
                   <w:tcMar>
-                    <w:top w:w="50" w:type="dxa"/>
+                    <w:top w:w="30" w:type="dxa"/>
                     <w:left w:w="70" w:type="dxa"/>
-                    <w:bottom w:w="50" w:type="dxa"/>
+                    <w:bottom w:w="30" w:type="dxa"/>
                     <w:right w:w="70" w:type="dxa"/>
                   </w:tcMar>
                 </w:tcPr>
@@ -17893,9 +18087,9 @@
                     <w:right w:val="single" w:sz="4" w:color="C8CDC2"/>
                   </w:tcBorders>
                   <w:tcMar>
-                    <w:top w:w="50" w:type="dxa"/>
+                    <w:top w:w="30" w:type="dxa"/>
                     <w:left w:w="70" w:type="dxa"/>
-                    <w:bottom w:w="50" w:type="dxa"/>
+                    <w:bottom w:w="30" w:type="dxa"/>
                     <w:right w:w="70" w:type="dxa"/>
                   </w:tcMar>
                 </w:tcPr>
@@ -17925,9 +18119,9 @@
                     <w:right w:val="single" w:sz="4" w:color="C8CDC2"/>
                   </w:tcBorders>
                   <w:tcMar>
-                    <w:top w:w="50" w:type="dxa"/>
+                    <w:top w:w="30" w:type="dxa"/>
                     <w:left w:w="70" w:type="dxa"/>
-                    <w:bottom w:w="50" w:type="dxa"/>
+                    <w:bottom w:w="30" w:type="dxa"/>
                     <w:right w:w="70" w:type="dxa"/>
                   </w:tcMar>
                 </w:tcPr>
@@ -18013,7 +18207,9 @@
               <w:rPr>
                 <w:rFonts w:ascii="Trade Gothic Next" w:hAnsi="Trade Gothic Next"/>
                 <w:b w:val="0"/>
+                <w:color w:val="14161B"/>
                 <w:sz w:val="17"/>
+                <w:u w:val="none"/>
               </w:rPr>
               <w:t>Three steps that produce the light</w:t>
             </w:r>
@@ -18026,7 +18222,9 @@
               <w:rPr>
                 <w:rFonts w:ascii="Trade Gothic Next" w:hAnsi="Trade Gothic Next"/>
                 <w:b w:val="0"/>
+                <w:color w:val="14161B"/>
                 <w:sz w:val="17"/>
+                <w:u w:val="none"/>
               </w:rPr>
               <w:t>Reason only certain colors appear</w:t>
             </w:r>
@@ -18179,10 +18377,10 @@
           </w:p>
           <w:p>
             <w:pPr>
-              <w:spacing w:after="40" w:before="0"/>
               <w:pBdr>
                 <w:left w:val="single" w:sz="18" w:space="6" w:color="A3E635"/>
               </w:pBdr>
+              <w:spacing w:after="40" w:before="0"/>
             </w:pPr>
             <w:r>
               <w:rPr>
@@ -18267,7 +18465,9 @@
               <w:rPr>
                 <w:rFonts w:ascii="Trade Gothic Next" w:hAnsi="Trade Gothic Next"/>
                 <w:b w:val="0"/>
+                <w:color w:val="14161B"/>
                 <w:sz w:val="17"/>
+                <w:u w:val="none"/>
               </w:rPr>
               <w:t>Table — four visible lines</w:t>
             </w:r>
@@ -18280,7 +18480,9 @@
               <w:rPr>
                 <w:rFonts w:ascii="Trade Gothic Next" w:hAnsi="Trade Gothic Next"/>
                 <w:b w:val="0"/>
+                <w:color w:val="14161B"/>
                 <w:sz w:val="17"/>
+                <w:u w:val="none"/>
               </w:rPr>
               <w:t>Largest drop of the four</w:t>
             </w:r>
@@ -18519,9 +18721,9 @@
                     <w:right w:val="single" w:sz="4" w:color="C8CDC2"/>
                   </w:tcBorders>
                   <w:tcMar>
-                    <w:top w:w="50" w:type="dxa"/>
+                    <w:top w:w="30" w:type="dxa"/>
                     <w:left w:w="70" w:type="dxa"/>
-                    <w:bottom w:w="50" w:type="dxa"/>
+                    <w:bottom w:w="30" w:type="dxa"/>
                     <w:right w:w="70" w:type="dxa"/>
                   </w:tcMar>
                 </w:tcPr>
@@ -18551,9 +18753,9 @@
                     <w:right w:val="single" w:sz="4" w:color="C8CDC2"/>
                   </w:tcBorders>
                   <w:tcMar>
-                    <w:top w:w="50" w:type="dxa"/>
+                    <w:top w:w="30" w:type="dxa"/>
                     <w:left w:w="70" w:type="dxa"/>
-                    <w:bottom w:w="50" w:type="dxa"/>
+                    <w:bottom w:w="30" w:type="dxa"/>
                     <w:right w:w="70" w:type="dxa"/>
                   </w:tcMar>
                 </w:tcPr>
@@ -18583,9 +18785,9 @@
                     <w:right w:val="single" w:sz="4" w:color="C8CDC2"/>
                   </w:tcBorders>
                   <w:tcMar>
-                    <w:top w:w="50" w:type="dxa"/>
+                    <w:top w:w="30" w:type="dxa"/>
                     <w:left w:w="70" w:type="dxa"/>
-                    <w:bottom w:w="50" w:type="dxa"/>
+                    <w:bottom w:w="30" w:type="dxa"/>
                     <w:right w:w="70" w:type="dxa"/>
                   </w:tcMar>
                 </w:tcPr>
@@ -18620,9 +18822,9 @@
                     <w:right w:val="single" w:sz="4" w:color="C8CDC2"/>
                   </w:tcBorders>
                   <w:tcMar>
-                    <w:top w:w="50" w:type="dxa"/>
+                    <w:top w:w="30" w:type="dxa"/>
                     <w:left w:w="70" w:type="dxa"/>
-                    <w:bottom w:w="50" w:type="dxa"/>
+                    <w:bottom w:w="30" w:type="dxa"/>
                     <w:right w:w="70" w:type="dxa"/>
                   </w:tcMar>
                 </w:tcPr>
@@ -18652,9 +18854,9 @@
                     <w:right w:val="single" w:sz="4" w:color="C8CDC2"/>
                   </w:tcBorders>
                   <w:tcMar>
-                    <w:top w:w="50" w:type="dxa"/>
+                    <w:top w:w="30" w:type="dxa"/>
                     <w:left w:w="70" w:type="dxa"/>
-                    <w:bottom w:w="50" w:type="dxa"/>
+                    <w:bottom w:w="30" w:type="dxa"/>
                     <w:right w:w="70" w:type="dxa"/>
                   </w:tcMar>
                 </w:tcPr>
@@ -18684,9 +18886,9 @@
                     <w:right w:val="single" w:sz="4" w:color="C8CDC2"/>
                   </w:tcBorders>
                   <w:tcMar>
-                    <w:top w:w="50" w:type="dxa"/>
+                    <w:top w:w="30" w:type="dxa"/>
                     <w:left w:w="70" w:type="dxa"/>
-                    <w:bottom w:w="50" w:type="dxa"/>
+                    <w:bottom w:w="30" w:type="dxa"/>
                     <w:right w:w="70" w:type="dxa"/>
                   </w:tcMar>
                 </w:tcPr>
@@ -18721,9 +18923,9 @@
                     <w:right w:val="single" w:sz="4" w:color="C8CDC2"/>
                   </w:tcBorders>
                   <w:tcMar>
-                    <w:top w:w="50" w:type="dxa"/>
+                    <w:top w:w="30" w:type="dxa"/>
                     <w:left w:w="70" w:type="dxa"/>
-                    <w:bottom w:w="50" w:type="dxa"/>
+                    <w:bottom w:w="30" w:type="dxa"/>
                     <w:right w:w="70" w:type="dxa"/>
                   </w:tcMar>
                 </w:tcPr>
@@ -18753,9 +18955,9 @@
                     <w:right w:val="single" w:sz="4" w:color="C8CDC2"/>
                   </w:tcBorders>
                   <w:tcMar>
-                    <w:top w:w="50" w:type="dxa"/>
+                    <w:top w:w="30" w:type="dxa"/>
                     <w:left w:w="70" w:type="dxa"/>
-                    <w:bottom w:w="50" w:type="dxa"/>
+                    <w:bottom w:w="30" w:type="dxa"/>
                     <w:right w:w="70" w:type="dxa"/>
                   </w:tcMar>
                 </w:tcPr>
@@ -18785,9 +18987,9 @@
                     <w:right w:val="single" w:sz="4" w:color="C8CDC2"/>
                   </w:tcBorders>
                   <w:tcMar>
-                    <w:top w:w="50" w:type="dxa"/>
+                    <w:top w:w="30" w:type="dxa"/>
                     <w:left w:w="70" w:type="dxa"/>
-                    <w:bottom w:w="50" w:type="dxa"/>
+                    <w:bottom w:w="30" w:type="dxa"/>
                     <w:right w:w="70" w:type="dxa"/>
                   </w:tcMar>
                 </w:tcPr>
@@ -18822,9 +19024,9 @@
                     <w:right w:val="single" w:sz="4" w:color="C8CDC2"/>
                   </w:tcBorders>
                   <w:tcMar>
-                    <w:top w:w="50" w:type="dxa"/>
+                    <w:top w:w="30" w:type="dxa"/>
                     <w:left w:w="70" w:type="dxa"/>
-                    <w:bottom w:w="50" w:type="dxa"/>
+                    <w:bottom w:w="30" w:type="dxa"/>
                     <w:right w:w="70" w:type="dxa"/>
                   </w:tcMar>
                 </w:tcPr>
@@ -18854,9 +19056,9 @@
                     <w:right w:val="single" w:sz="4" w:color="C8CDC2"/>
                   </w:tcBorders>
                   <w:tcMar>
-                    <w:top w:w="50" w:type="dxa"/>
+                    <w:top w:w="30" w:type="dxa"/>
                     <w:left w:w="70" w:type="dxa"/>
-                    <w:bottom w:w="50" w:type="dxa"/>
+                    <w:bottom w:w="30" w:type="dxa"/>
                     <w:right w:w="70" w:type="dxa"/>
                   </w:tcMar>
                 </w:tcPr>
@@ -18886,9 +19088,9 @@
                     <w:right w:val="single" w:sz="4" w:color="C8CDC2"/>
                   </w:tcBorders>
                   <w:tcMar>
-                    <w:top w:w="50" w:type="dxa"/>
+                    <w:top w:w="30" w:type="dxa"/>
                     <w:left w:w="70" w:type="dxa"/>
-                    <w:bottom w:w="50" w:type="dxa"/>
+                    <w:bottom w:w="30" w:type="dxa"/>
                     <w:right w:w="70" w:type="dxa"/>
                   </w:tcMar>
                 </w:tcPr>
@@ -18974,7 +19176,9 @@
               <w:rPr>
                 <w:rFonts w:ascii="Trade Gothic Next" w:hAnsi="Trade Gothic Next"/>
                 <w:b w:val="0"/>
+                <w:color w:val="14161B"/>
                 <w:sz w:val="17"/>
+                <w:u w:val="none"/>
               </w:rPr>
               <w:t>Source of the flame light</w:t>
             </w:r>
@@ -18987,7 +19191,9 @@
               <w:rPr>
                 <w:rFonts w:ascii="Trade Gothic Next" w:hAnsi="Trade Gothic Next"/>
                 <w:b w:val="0"/>
+                <w:color w:val="14161B"/>
                 <w:sz w:val="17"/>
+                <w:u w:val="none"/>
               </w:rPr>
               <w:t>Limit of a flame color</w:t>
             </w:r>
@@ -19000,7 +19206,9 @@
               <w:rPr>
                 <w:rFonts w:ascii="Trade Gothic Next" w:hAnsi="Trade Gothic Next"/>
                 <w:b w:val="0"/>
+                <w:color w:val="14161B"/>
                 <w:sz w:val="17"/>
+                <w:u w:val="none"/>
               </w:rPr>
               <w:t>Table — flame colors by ion</w:t>
             </w:r>
@@ -19143,10 +19351,10 @@
           </w:p>
           <w:p>
             <w:pPr>
-              <w:spacing w:after="40" w:before="0"/>
               <w:pBdr>
                 <w:left w:val="single" w:sz="18" w:space="6" w:color="A3E635"/>
               </w:pBdr>
+              <w:spacing w:after="40" w:before="0"/>
             </w:pPr>
             <w:r>
               <w:rPr>
@@ -19267,9 +19475,9 @@
                     <w:right w:val="single" w:sz="4" w:color="C8CDC2"/>
                   </w:tcBorders>
                   <w:tcMar>
-                    <w:top w:w="50" w:type="dxa"/>
+                    <w:top w:w="30" w:type="dxa"/>
                     <w:left w:w="70" w:type="dxa"/>
-                    <w:bottom w:w="50" w:type="dxa"/>
+                    <w:bottom w:w="30" w:type="dxa"/>
                     <w:right w:w="70" w:type="dxa"/>
                   </w:tcMar>
                 </w:tcPr>
@@ -19310,9 +19518,9 @@
                     <w:right w:val="single" w:sz="4" w:color="C8CDC2"/>
                   </w:tcBorders>
                   <w:tcMar>
-                    <w:top w:w="50" w:type="dxa"/>
+                    <w:top w:w="30" w:type="dxa"/>
                     <w:left w:w="70" w:type="dxa"/>
-                    <w:bottom w:w="50" w:type="dxa"/>
+                    <w:bottom w:w="30" w:type="dxa"/>
                     <w:right w:w="70" w:type="dxa"/>
                   </w:tcMar>
                 </w:tcPr>
@@ -19347,9 +19555,9 @@
                     <w:right w:val="single" w:sz="4" w:color="C8CDC2"/>
                   </w:tcBorders>
                   <w:tcMar>
-                    <w:top w:w="50" w:type="dxa"/>
+                    <w:top w:w="30" w:type="dxa"/>
                     <w:left w:w="70" w:type="dxa"/>
-                    <w:bottom w:w="50" w:type="dxa"/>
+                    <w:bottom w:w="30" w:type="dxa"/>
                     <w:right w:w="70" w:type="dxa"/>
                   </w:tcMar>
                 </w:tcPr>
@@ -19390,9 +19598,9 @@
                     <w:right w:val="single" w:sz="4" w:color="C8CDC2"/>
                   </w:tcBorders>
                   <w:tcMar>
-                    <w:top w:w="50" w:type="dxa"/>
+                    <w:top w:w="30" w:type="dxa"/>
                     <w:left w:w="70" w:type="dxa"/>
-                    <w:bottom w:w="50" w:type="dxa"/>
+                    <w:bottom w:w="30" w:type="dxa"/>
                     <w:right w:w="70" w:type="dxa"/>
                   </w:tcMar>
                 </w:tcPr>
@@ -19427,9 +19635,9 @@
                     <w:right w:val="single" w:sz="4" w:color="C8CDC2"/>
                   </w:tcBorders>
                   <w:tcMar>
-                    <w:top w:w="50" w:type="dxa"/>
+                    <w:top w:w="30" w:type="dxa"/>
                     <w:left w:w="70" w:type="dxa"/>
-                    <w:bottom w:w="50" w:type="dxa"/>
+                    <w:bottom w:w="30" w:type="dxa"/>
                     <w:right w:w="70" w:type="dxa"/>
                   </w:tcMar>
                 </w:tcPr>
@@ -19470,9 +19678,9 @@
                     <w:right w:val="single" w:sz="4" w:color="C8CDC2"/>
                   </w:tcBorders>
                   <w:tcMar>
-                    <w:top w:w="50" w:type="dxa"/>
+                    <w:top w:w="30" w:type="dxa"/>
                     <w:left w:w="70" w:type="dxa"/>
-                    <w:bottom w:w="50" w:type="dxa"/>
+                    <w:bottom w:w="30" w:type="dxa"/>
                     <w:right w:w="70" w:type="dxa"/>
                   </w:tcMar>
                 </w:tcPr>
@@ -19507,9 +19715,9 @@
                     <w:right w:val="single" w:sz="4" w:color="C8CDC2"/>
                   </w:tcBorders>
                   <w:tcMar>
-                    <w:top w:w="50" w:type="dxa"/>
+                    <w:top w:w="30" w:type="dxa"/>
                     <w:left w:w="70" w:type="dxa"/>
-                    <w:bottom w:w="50" w:type="dxa"/>
+                    <w:bottom w:w="30" w:type="dxa"/>
                     <w:right w:w="70" w:type="dxa"/>
                   </w:tcMar>
                 </w:tcPr>
@@ -19550,9 +19758,9 @@
                     <w:right w:val="single" w:sz="4" w:color="C8CDC2"/>
                   </w:tcBorders>
                   <w:tcMar>
-                    <w:top w:w="50" w:type="dxa"/>
+                    <w:top w:w="30" w:type="dxa"/>
                     <w:left w:w="70" w:type="dxa"/>
-                    <w:bottom w:w="50" w:type="dxa"/>
+                    <w:bottom w:w="30" w:type="dxa"/>
                     <w:right w:w="70" w:type="dxa"/>
                   </w:tcMar>
                 </w:tcPr>
@@ -19587,9 +19795,9 @@
                     <w:right w:val="single" w:sz="4" w:color="C8CDC2"/>
                   </w:tcBorders>
                   <w:tcMar>
-                    <w:top w:w="50" w:type="dxa"/>
+                    <w:top w:w="30" w:type="dxa"/>
                     <w:left w:w="70" w:type="dxa"/>
-                    <w:bottom w:w="50" w:type="dxa"/>
+                    <w:bottom w:w="30" w:type="dxa"/>
                     <w:right w:w="70" w:type="dxa"/>
                   </w:tcMar>
                 </w:tcPr>
@@ -19630,9 +19838,9 @@
                     <w:right w:val="single" w:sz="4" w:color="C8CDC2"/>
                   </w:tcBorders>
                   <w:tcMar>
-                    <w:top w:w="50" w:type="dxa"/>
+                    <w:top w:w="30" w:type="dxa"/>
                     <w:left w:w="70" w:type="dxa"/>
-                    <w:bottom w:w="50" w:type="dxa"/>
+                    <w:bottom w:w="30" w:type="dxa"/>
                     <w:right w:w="70" w:type="dxa"/>
                   </w:tcMar>
                 </w:tcPr>
@@ -19667,9 +19875,9 @@
                     <w:right w:val="single" w:sz="4" w:color="C8CDC2"/>
                   </w:tcBorders>
                   <w:tcMar>
-                    <w:top w:w="50" w:type="dxa"/>
+                    <w:top w:w="30" w:type="dxa"/>
                     <w:left w:w="70" w:type="dxa"/>
-                    <w:bottom w:w="50" w:type="dxa"/>
+                    <w:bottom w:w="30" w:type="dxa"/>
                     <w:right w:w="70" w:type="dxa"/>
                   </w:tcMar>
                 </w:tcPr>
@@ -19710,9 +19918,9 @@
                     <w:right w:val="single" w:sz="4" w:color="C8CDC2"/>
                   </w:tcBorders>
                   <w:tcMar>
-                    <w:top w:w="50" w:type="dxa"/>
+                    <w:top w:w="30" w:type="dxa"/>
                     <w:left w:w="70" w:type="dxa"/>
-                    <w:bottom w:w="50" w:type="dxa"/>
+                    <w:bottom w:w="30" w:type="dxa"/>
                     <w:right w:w="70" w:type="dxa"/>
                   </w:tcMar>
                 </w:tcPr>
@@ -19747,9 +19955,9 @@
                     <w:right w:val="single" w:sz="4" w:color="C8CDC2"/>
                   </w:tcBorders>
                   <w:tcMar>
-                    <w:top w:w="50" w:type="dxa"/>
+                    <w:top w:w="30" w:type="dxa"/>
                     <w:left w:w="70" w:type="dxa"/>
-                    <w:bottom w:w="50" w:type="dxa"/>
+                    <w:bottom w:w="30" w:type="dxa"/>
                     <w:right w:w="70" w:type="dxa"/>
                   </w:tcMar>
                 </w:tcPr>
@@ -19790,9 +19998,9 @@
                     <w:right w:val="single" w:sz="4" w:color="C8CDC2"/>
                   </w:tcBorders>
                   <w:tcMar>
-                    <w:top w:w="50" w:type="dxa"/>
+                    <w:top w:w="30" w:type="dxa"/>
                     <w:left w:w="70" w:type="dxa"/>
-                    <w:bottom w:w="50" w:type="dxa"/>
+                    <w:bottom w:w="30" w:type="dxa"/>
                     <w:right w:w="70" w:type="dxa"/>
                   </w:tcMar>
                 </w:tcPr>
@@ -19878,7 +20086,9 @@
               <w:rPr>
                 <w:rFonts w:ascii="Trade Gothic Next" w:hAnsi="Trade Gothic Next"/>
                 <w:b w:val="0"/>
+                <w:color w:val="14161B"/>
                 <w:sz w:val="17"/>
+                <w:u w:val="none"/>
               </w:rPr>
               <w:t>Reason hydrogen emits set wavelengths</w:t>
             </w:r>
@@ -19891,7 +20101,9 @@
               <w:rPr>
                 <w:rFonts w:ascii="Trade Gothic Next" w:hAnsi="Trade Gothic Next"/>
                 <w:b w:val="0"/>
+                <w:color w:val="14161B"/>
                 <w:sz w:val="17"/>
+                <w:u w:val="none"/>
               </w:rPr>
               <w:t>d sublevel capacity</w:t>
             </w:r>
@@ -19904,7 +20116,9 @@
               <w:rPr>
                 <w:rFonts w:ascii="Trade Gothic Next" w:hAnsi="Trade Gothic Next"/>
                 <w:b w:val="0"/>
+                <w:color w:val="14161B"/>
                 <w:sz w:val="17"/>
+                <w:u w:val="none"/>
               </w:rPr>
               <w:t>Sulfur configuration and unpaired count</w:t>
             </w:r>
@@ -19917,9 +20131,22 @@
               <w:rPr>
                 <w:rFonts w:ascii="Trade Gothic Next" w:hAnsi="Trade Gothic Next"/>
                 <w:b w:val="0"/>
+                <w:color w:val="14161B"/>
                 <w:sz w:val="17"/>
-              </w:rPr>
-              <w:t>Electrons lost first from Fe^3+^</w:t>
+                <w:u w:val="none"/>
+              </w:rPr>
+              <w:t>Electrons lost first from Fe</w:t>
+            </w:r>
+            <w:r>
+              <w:rPr>
+                <w:rFonts w:ascii="Trade Gothic Next" w:hAnsi="Trade Gothic Next"/>
+                <w:b w:val="0"/>
+                <w:color w:val="14161B"/>
+                <w:sz w:val="17"/>
+                <w:u w:val="none"/>
+                <w:vertAlign w:val="superscript"/>
+              </w:rPr>
+              <w:t>3+</w:t>
             </w:r>
           </w:p>
           <w:p>
@@ -19930,7 +20157,9 @@
               <w:rPr>
                 <w:rFonts w:ascii="Trade Gothic Next" w:hAnsi="Trade Gothic Next"/>
                 <w:b w:val="0"/>
+                <w:color w:val="14161B"/>
                 <w:sz w:val="17"/>
+                <w:u w:val="none"/>
               </w:rPr>
               <w:t>Higher-energy photon, 410 nm or 656 nm</w:t>
             </w:r>
@@ -20789,7 +21018,7 @@
                 <w:sz w:val="17"/>
                 <w:u w:val="none"/>
               </w:rPr>
-              <w:t>S2.1</w:t>
+              <w:t>S02.1</w:t>
             </w:r>
           </w:p>
         </w:tc>
@@ -20934,7 +21163,7 @@
                 <w:sz w:val="17"/>
                 <w:u w:val="none"/>
               </w:rPr>
-              <w:t>S2.1</w:t>
+              <w:t>S02.1</w:t>
             </w:r>
           </w:p>
         </w:tc>
@@ -21079,7 +21308,7 @@
                 <w:sz w:val="17"/>
                 <w:u w:val="none"/>
               </w:rPr>
-              <w:t>S2.2</w:t>
+              <w:t>S02.2</w:t>
             </w:r>
           </w:p>
         </w:tc>
@@ -21254,7 +21483,7 @@
                 <w:sz w:val="17"/>
                 <w:u w:val="none"/>
               </w:rPr>
-              <w:t>S2.2</w:t>
+              <w:t>S02.2</w:t>
             </w:r>
           </w:p>
         </w:tc>
@@ -21389,7 +21618,7 @@
                 <w:sz w:val="17"/>
                 <w:u w:val="none"/>
               </w:rPr>
-              <w:t>S2.3</w:t>
+              <w:t>S02.3</w:t>
             </w:r>
           </w:p>
         </w:tc>
@@ -21534,7 +21763,7 @@
                 <w:sz w:val="17"/>
                 <w:u w:val="none"/>
               </w:rPr>
-              <w:t>S2.3</w:t>
+              <w:t>S02.3</w:t>
             </w:r>
           </w:p>
         </w:tc>
@@ -21749,7 +21978,7 @@
                 <w:sz w:val="17"/>
                 <w:u w:val="none"/>
               </w:rPr>
-              <w:t>S2.3</w:t>
+              <w:t>S02.3</w:t>
             </w:r>
           </w:p>
         </w:tc>
@@ -21884,7 +22113,7 @@
                 <w:sz w:val="17"/>
                 <w:u w:val="none"/>
               </w:rPr>
-              <w:t>S2.4</w:t>
+              <w:t>S02.4</w:t>
             </w:r>
           </w:p>
         </w:tc>
@@ -22029,7 +22258,7 @@
                 <w:sz w:val="17"/>
                 <w:u w:val="none"/>
               </w:rPr>
-              <w:t>S2.4</w:t>
+              <w:t>S02.4</w:t>
             </w:r>
           </w:p>
         </w:tc>
@@ -22134,7 +22363,7 @@
                 <w:sz w:val="17"/>
                 <w:u w:val="none"/>
               </w:rPr>
-              <w:t>S2.4</w:t>
+              <w:t>S02.4</w:t>
             </w:r>
           </w:p>
         </w:tc>
@@ -22359,7 +22588,7 @@
                 <w:sz w:val="17"/>
                 <w:u w:val="none"/>
               </w:rPr>
-              <w:t>S2.4</w:t>
+              <w:t>S02.4</w:t>
             </w:r>
           </w:p>
         </w:tc>
@@ -22504,7 +22733,7 @@
                 <w:sz w:val="17"/>
                 <w:u w:val="none"/>
               </w:rPr>
-              <w:t>S2.5</w:t>
+              <w:t>S02.5</w:t>
             </w:r>
           </w:p>
         </w:tc>
@@ -22669,7 +22898,7 @@
                 <w:sz w:val="17"/>
                 <w:u w:val="none"/>
               </w:rPr>
-              <w:t>S2.5</w:t>
+              <w:t>S02.5</w:t>
             </w:r>
           </w:p>
         </w:tc>
@@ -22814,7 +23043,7 @@
                 <w:sz w:val="17"/>
                 <w:u w:val="none"/>
               </w:rPr>
-              <w:t>S2.5</w:t>
+              <w:t>S02.5</w:t>
             </w:r>
           </w:p>
         </w:tc>
@@ -23024,7 +23253,7 @@
                 <w:color w:val="14161B"/>
                 <w:sz w:val="18"/>
               </w:rPr>
-              <w:t xml:space="preserve">   S2.1  I can define quantized and name ground and excited states.</w:t>
+              <w:t xml:space="preserve">   S02.1  I can define quantized and name ground and excited states.</w:t>
             </w:r>
           </w:p>
           <w:p>
@@ -23047,7 +23276,7 @@
                 <w:color w:val="14161B"/>
                 <w:sz w:val="18"/>
               </w:rPr>
-              <w:t xml:space="preserve">   S2.2  I can give the capacity of s, p, d and f and count orbitals in a level.</w:t>
+              <w:t xml:space="preserve">   S02.2  I can give the capacity of s, p, d and f and count orbitals in a level.</w:t>
             </w:r>
           </w:p>
           <w:p>
@@ -23070,7 +23299,7 @@
                 <w:color w:val="14161B"/>
                 <w:sz w:val="18"/>
               </w:rPr>
-              <w:t xml:space="preserve">   S2.3  I can write a configuration, shorthand and orbital diagram.</w:t>
+              <w:t xml:space="preserve">   S02.3  I can write a configuration, shorthand and orbital diagram.</w:t>
             </w:r>
           </w:p>
           <w:p>
@@ -23093,7 +23322,7 @@
                 <w:color w:val="14161B"/>
                 <w:sz w:val="18"/>
               </w:rPr>
-              <w:t xml:space="preserve">   S2.4  I can predict the ion an atom forms from its group.</w:t>
+              <w:t xml:space="preserve">   S02.4  I can predict the ion an atom forms from its group.</w:t>
             </w:r>
           </w:p>
           <w:p>
@@ -23116,7 +23345,7 @@
                 <w:color w:val="14161B"/>
                 <w:sz w:val="18"/>
               </w:rPr>
-              <w:t xml:space="preserve">   S2.5  I can link electron drops to the light atoms give off.</w:t>
+              <w:t xml:space="preserve">   S02.5  I can link electron drops to the light atoms give off.</w:t>
             </w:r>
           </w:p>
           <w:p>

</xml_diff>